<commit_message>
added room generation to word docuemnt
</commit_message>
<xml_diff>
--- a/NEA Paperwork HP.docx
+++ b/NEA Paperwork HP.docx
@@ -85,13 +85,13 @@
             </w:rPr>
             <w:fldChar w:fldCharType="separate"/>
           </w:r>
-          <w:hyperlink w:anchor="_Toc239941469" w:history="1">
+          <w:hyperlink w:anchor="_Toc240354264" w:history="1">
             <w:r>
               <w:rPr>
                 <w:rStyle w:val="Hyperlink"/>
                 <w:noProof/>
               </w:rPr>
-              <w:t>Analysis</w:t>
+              <w:t>ANALYSIS</w:t>
             </w:r>
             <w:r>
               <w:rPr>
@@ -112,7 +112,7 @@
                 <w:noProof/>
                 <w:webHidden/>
               </w:rPr>
-              <w:instrText xml:space="preserve"> PAGEREF _Toc239941469 \h </w:instrText>
+              <w:instrText xml:space="preserve"> PAGEREF _Toc240354264 \h </w:instrText>
             </w:r>
             <w:r>
               <w:rPr>
@@ -158,13 +158,13 @@
               <w14:ligatures w14:val="standardContextual"/>
             </w:rPr>
           </w:pPr>
-          <w:hyperlink w:anchor="_Toc239941470" w:history="1">
+          <w:hyperlink w:anchor="_Toc240354265" w:history="1">
             <w:r>
               <w:rPr>
                 <w:rStyle w:val="Hyperlink"/>
                 <w:noProof/>
               </w:rPr>
-              <w:t>Project Background</w:t>
+              <w:t>PROJECT BACKGROUND</w:t>
             </w:r>
             <w:r>
               <w:rPr>
@@ -185,7 +185,7 @@
                 <w:noProof/>
                 <w:webHidden/>
               </w:rPr>
-              <w:instrText xml:space="preserve"> PAGEREF _Toc239941470 \h </w:instrText>
+              <w:instrText xml:space="preserve"> PAGEREF _Toc240354265 \h </w:instrText>
             </w:r>
             <w:r>
               <w:rPr>
@@ -231,13 +231,13 @@
               <w14:ligatures w14:val="standardContextual"/>
             </w:rPr>
           </w:pPr>
-          <w:hyperlink w:anchor="_Toc239941471" w:history="1">
+          <w:hyperlink w:anchor="_Toc240354266" w:history="1">
             <w:r>
               <w:rPr>
                 <w:rStyle w:val="Hyperlink"/>
                 <w:noProof/>
               </w:rPr>
-              <w:t>Client Interview</w:t>
+              <w:t>CLIENT INTERVIEW</w:t>
             </w:r>
             <w:r>
               <w:rPr>
@@ -258,7 +258,7 @@
                 <w:noProof/>
                 <w:webHidden/>
               </w:rPr>
-              <w:instrText xml:space="preserve"> PAGEREF _Toc239941471 \h </w:instrText>
+              <w:instrText xml:space="preserve"> PAGEREF _Toc240354266 \h </w:instrText>
             </w:r>
             <w:r>
               <w:rPr>
@@ -304,13 +304,13 @@
               <w14:ligatures w14:val="standardContextual"/>
             </w:rPr>
           </w:pPr>
-          <w:hyperlink w:anchor="_Toc239941472" w:history="1">
+          <w:hyperlink w:anchor="_Toc240354267" w:history="1">
             <w:r>
               <w:rPr>
                 <w:rStyle w:val="Hyperlink"/>
                 <w:noProof/>
               </w:rPr>
-              <w:t>Reflections of Client Interview</w:t>
+              <w:t>REFLECTIONS</w:t>
             </w:r>
             <w:r>
               <w:rPr>
@@ -331,7 +331,7 @@
                 <w:noProof/>
                 <w:webHidden/>
               </w:rPr>
-              <w:instrText xml:space="preserve"> PAGEREF _Toc239941472 \h </w:instrText>
+              <w:instrText xml:space="preserve"> PAGEREF _Toc240354267 \h </w:instrText>
             </w:r>
             <w:r>
               <w:rPr>
@@ -377,13 +377,13 @@
               <w14:ligatures w14:val="standardContextual"/>
             </w:rPr>
           </w:pPr>
-          <w:hyperlink w:anchor="_Toc239941473" w:history="1">
+          <w:hyperlink w:anchor="_Toc240354268" w:history="1">
             <w:r>
               <w:rPr>
                 <w:rStyle w:val="Hyperlink"/>
                 <w:noProof/>
               </w:rPr>
-              <w:t>Objectives</w:t>
+              <w:t>OBJECTIVES</w:t>
             </w:r>
             <w:r>
               <w:rPr>
@@ -404,7 +404,7 @@
                 <w:noProof/>
                 <w:webHidden/>
               </w:rPr>
-              <w:instrText xml:space="preserve"> PAGEREF _Toc239941473 \h </w:instrText>
+              <w:instrText xml:space="preserve"> PAGEREF _Toc240354268 \h </w:instrText>
             </w:r>
             <w:r>
               <w:rPr>
@@ -450,27 +450,13 @@
               <w14:ligatures w14:val="standardContextual"/>
             </w:rPr>
           </w:pPr>
-          <w:hyperlink w:anchor="_Toc239941474" w:history="1">
+          <w:hyperlink w:anchor="_Toc240354269" w:history="1">
             <w:r>
               <w:rPr>
                 <w:rStyle w:val="Hyperlink"/>
                 <w:noProof/>
               </w:rPr>
-              <w:t>Modelli</w:t>
-            </w:r>
-            <w:r>
-              <w:rPr>
-                <w:rStyle w:val="Hyperlink"/>
-                <w:noProof/>
-              </w:rPr>
-              <w:t>n</w:t>
-            </w:r>
-            <w:r>
-              <w:rPr>
-                <w:rStyle w:val="Hyperlink"/>
-                <w:noProof/>
-              </w:rPr>
-              <w:t>g</w:t>
+              <w:t>MODELLING</w:t>
             </w:r>
             <w:r>
               <w:rPr>
@@ -491,7 +477,7 @@
                 <w:noProof/>
                 <w:webHidden/>
               </w:rPr>
-              <w:instrText xml:space="preserve"> PAGEREF _Toc239941474 \h </w:instrText>
+              <w:instrText xml:space="preserve"> PAGEREF _Toc240354269 \h </w:instrText>
             </w:r>
             <w:r>
               <w:rPr>
@@ -537,7 +523,7 @@
               <w14:ligatures w14:val="standardContextual"/>
             </w:rPr>
           </w:pPr>
-          <w:hyperlink w:anchor="_Toc239941475" w:history="1">
+          <w:hyperlink w:anchor="_Toc240354270" w:history="1">
             <w:r>
               <w:rPr>
                 <w:rStyle w:val="Hyperlink"/>
@@ -564,7 +550,7 @@
                 <w:noProof/>
                 <w:webHidden/>
               </w:rPr>
-              <w:instrText xml:space="preserve"> PAGEREF _Toc239941475 \h </w:instrText>
+              <w:instrText xml:space="preserve"> PAGEREF _Toc240354270 \h </w:instrText>
             </w:r>
             <w:r>
               <w:rPr>
@@ -610,7 +596,7 @@
               <w14:ligatures w14:val="standardContextual"/>
             </w:rPr>
           </w:pPr>
-          <w:hyperlink w:anchor="_Toc239941476" w:history="1">
+          <w:hyperlink w:anchor="_Toc240354271" w:history="1">
             <w:r>
               <w:rPr>
                 <w:rStyle w:val="Hyperlink"/>
@@ -637,7 +623,7 @@
                 <w:noProof/>
                 <w:webHidden/>
               </w:rPr>
-              <w:instrText xml:space="preserve"> PAGEREF _Toc239941476 \h </w:instrText>
+              <w:instrText xml:space="preserve"> PAGEREF _Toc240354271 \h </w:instrText>
             </w:r>
             <w:r>
               <w:rPr>
@@ -683,7 +669,7 @@
               <w14:ligatures w14:val="standardContextual"/>
             </w:rPr>
           </w:pPr>
-          <w:hyperlink w:anchor="_Toc239941477" w:history="1">
+          <w:hyperlink w:anchor="_Toc240354272" w:history="1">
             <w:r>
               <w:rPr>
                 <w:rStyle w:val="Hyperlink"/>
@@ -710,7 +696,7 @@
                 <w:noProof/>
                 <w:webHidden/>
               </w:rPr>
-              <w:instrText xml:space="preserve"> PAGEREF _Toc239941477 \h </w:instrText>
+              <w:instrText xml:space="preserve"> PAGEREF _Toc240354272 \h </w:instrText>
             </w:r>
             <w:r>
               <w:rPr>
@@ -756,7 +742,7 @@
               <w14:ligatures w14:val="standardContextual"/>
             </w:rPr>
           </w:pPr>
-          <w:hyperlink w:anchor="_Toc239941478" w:history="1">
+          <w:hyperlink w:anchor="_Toc240354273" w:history="1">
             <w:r>
               <w:rPr>
                 <w:rStyle w:val="Hyperlink"/>
@@ -783,7 +769,7 @@
                 <w:noProof/>
                 <w:webHidden/>
               </w:rPr>
-              <w:instrText xml:space="preserve"> PAGEREF _Toc239941478 \h </w:instrText>
+              <w:instrText xml:space="preserve"> PAGEREF _Toc240354273 \h </w:instrText>
             </w:r>
             <w:r>
               <w:rPr>
@@ -859,20 +845,16 @@
         </w:rPr>
       </w:pPr>
       <w:bookmarkStart w:id="0" w:name="__RefHeading___Toc1033_50594169"/>
-      <w:bookmarkStart w:id="1" w:name="_Toc229035136"/>
-      <w:bookmarkStart w:id="2" w:name="_Toc222817101"/>
-      <w:bookmarkStart w:id="3" w:name="_Toc239941469"/>
+      <w:bookmarkStart w:id="1" w:name="_Toc240354264"/>
       <w:bookmarkEnd w:id="0"/>
       <w:r>
         <w:rPr>
           <w:sz w:val="50"/>
           <w:szCs w:val="50"/>
         </w:rPr>
-        <w:t>Analysis</w:t>
+        <w:t>ANALYSIS</w:t>
       </w:r>
       <w:bookmarkEnd w:id="1"/>
-      <w:bookmarkEnd w:id="2"/>
-      <w:bookmarkEnd w:id="3"/>
     </w:p>
     <w:p/>
     <w:p>
@@ -883,21 +865,17 @@
           <w:szCs w:val="40"/>
         </w:rPr>
       </w:pPr>
-      <w:bookmarkStart w:id="4" w:name="__RefHeading___Toc1035_50594169"/>
-      <w:bookmarkStart w:id="5" w:name="_Toc229035137"/>
-      <w:bookmarkStart w:id="6" w:name="_Toc222817102"/>
-      <w:bookmarkStart w:id="7" w:name="_Toc239941470"/>
-      <w:bookmarkEnd w:id="4"/>
+      <w:bookmarkStart w:id="2" w:name="__RefHeading___Toc1035_50594169"/>
+      <w:bookmarkStart w:id="3" w:name="_Toc240354265"/>
+      <w:bookmarkEnd w:id="2"/>
       <w:r>
         <w:rPr>
           <w:sz w:val="40"/>
           <w:szCs w:val="40"/>
         </w:rPr>
-        <w:t>Project Background</w:t>
-      </w:r>
-      <w:bookmarkEnd w:id="5"/>
-      <w:bookmarkEnd w:id="6"/>
-      <w:bookmarkEnd w:id="7"/>
+        <w:t>PROJECT BACKGROUND</w:t>
+      </w:r>
+      <w:bookmarkEnd w:id="3"/>
     </w:p>
     <w:p>
       <w:pPr>
@@ -1007,21 +985,17 @@
           <w:szCs w:val="40"/>
         </w:rPr>
       </w:pPr>
-      <w:bookmarkStart w:id="8" w:name="__RefHeading___Toc1037_50594169"/>
-      <w:bookmarkStart w:id="9" w:name="_Toc229035138"/>
-      <w:bookmarkStart w:id="10" w:name="_Toc222817103"/>
-      <w:bookmarkStart w:id="11" w:name="_Toc239941471"/>
-      <w:bookmarkEnd w:id="8"/>
+      <w:bookmarkStart w:id="4" w:name="__RefHeading___Toc1037_50594169"/>
+      <w:bookmarkStart w:id="5" w:name="_Toc240354266"/>
+      <w:bookmarkEnd w:id="4"/>
       <w:r>
         <w:rPr>
           <w:sz w:val="40"/>
           <w:szCs w:val="40"/>
         </w:rPr>
-        <w:t>Client Interview</w:t>
-      </w:r>
-      <w:bookmarkEnd w:id="9"/>
-      <w:bookmarkEnd w:id="10"/>
-      <w:bookmarkEnd w:id="11"/>
+        <w:t>CLIENT INTERVIEW</w:t>
+      </w:r>
+      <w:bookmarkEnd w:id="5"/>
     </w:p>
     <w:p>
       <w:pPr>
@@ -1314,21 +1288,17 @@
           <w:szCs w:val="40"/>
         </w:rPr>
       </w:pPr>
-      <w:bookmarkStart w:id="12" w:name="__RefHeading___Toc1039_50594169"/>
-      <w:bookmarkStart w:id="13" w:name="_Toc229035139"/>
-      <w:bookmarkStart w:id="14" w:name="_Toc222817104"/>
-      <w:bookmarkStart w:id="15" w:name="_Toc239941472"/>
-      <w:bookmarkEnd w:id="12"/>
+      <w:bookmarkStart w:id="6" w:name="__RefHeading___Toc1039_50594169"/>
+      <w:bookmarkStart w:id="7" w:name="_Toc240354267"/>
+      <w:bookmarkEnd w:id="6"/>
       <w:r>
         <w:rPr>
           <w:sz w:val="40"/>
           <w:szCs w:val="40"/>
         </w:rPr>
-        <w:t>Reflections of Client Interview</w:t>
-      </w:r>
-      <w:bookmarkEnd w:id="13"/>
-      <w:bookmarkEnd w:id="14"/>
-      <w:bookmarkEnd w:id="15"/>
+        <w:t>REFLECTIONS</w:t>
+      </w:r>
+      <w:bookmarkEnd w:id="7"/>
     </w:p>
     <w:p>
       <w:pPr>
@@ -1414,21 +1384,17 @@
           <w:szCs w:val="40"/>
         </w:rPr>
       </w:pPr>
-      <w:bookmarkStart w:id="16" w:name="__RefHeading___Toc1041_50594169"/>
-      <w:bookmarkStart w:id="17" w:name="_Toc229035140"/>
-      <w:bookmarkStart w:id="18" w:name="_Toc222817105"/>
-      <w:bookmarkStart w:id="19" w:name="_Toc239941473"/>
-      <w:bookmarkEnd w:id="16"/>
+      <w:bookmarkStart w:id="8" w:name="__RefHeading___Toc1041_50594169"/>
+      <w:bookmarkStart w:id="9" w:name="_Toc240354268"/>
+      <w:bookmarkEnd w:id="8"/>
       <w:r>
         <w:rPr>
           <w:sz w:val="40"/>
           <w:szCs w:val="40"/>
         </w:rPr>
-        <w:t>Objectives</w:t>
-      </w:r>
-      <w:bookmarkEnd w:id="17"/>
-      <w:bookmarkEnd w:id="18"/>
-      <w:bookmarkEnd w:id="19"/>
+        <w:t>OBJECTIVES</w:t>
+      </w:r>
+      <w:bookmarkEnd w:id="9"/>
     </w:p>
     <w:p>
       <w:pPr>
@@ -2728,50 +2694,53 @@
           <w:szCs w:val="40"/>
         </w:rPr>
       </w:pPr>
-      <w:bookmarkStart w:id="20" w:name="__RefHeading___Toc1043_50594169"/>
-      <w:bookmarkStart w:id="21" w:name="_Toc229035141"/>
-      <w:bookmarkStart w:id="22" w:name="_Toc222817106"/>
-      <w:bookmarkStart w:id="23" w:name="_Toc239941474"/>
-      <w:bookmarkEnd w:id="20"/>
+      <w:bookmarkStart w:id="10" w:name="__RefHeading___Toc1043_50594169"/>
+      <w:bookmarkStart w:id="11" w:name="_Toc229035141"/>
+      <w:bookmarkStart w:id="12" w:name="_Toc222817106"/>
+      <w:bookmarkStart w:id="13" w:name="_Toc240354269"/>
+      <w:bookmarkEnd w:id="10"/>
       <w:r>
         <w:rPr>
           <w:sz w:val="40"/>
           <w:szCs w:val="40"/>
         </w:rPr>
         <w:lastRenderedPageBreak/>
-        <w:t>Modelling</w:t>
-      </w:r>
-      <w:bookmarkEnd w:id="21"/>
-      <w:bookmarkEnd w:id="22"/>
-      <w:bookmarkEnd w:id="23"/>
-    </w:p>
-    <w:p>
-      <w:pPr>
-        <w:jc w:val="center"/>
-        <w:rPr>
-          <w:sz w:val="24"/>
-          <w:szCs w:val="24"/>
-        </w:rPr>
-      </w:pPr>
-    </w:p>
-    <w:p>
-      <w:pPr>
-        <w:jc w:val="center"/>
-        <w:rPr>
-          <w:b/>
-          <w:bCs/>
+        <w:t>M</w:t>
+      </w:r>
+      <w:bookmarkEnd w:id="11"/>
+      <w:bookmarkEnd w:id="12"/>
+      <w:r>
+        <w:rPr>
+          <w:sz w:val="40"/>
+          <w:szCs w:val="40"/>
+        </w:rPr>
+        <w:t>ODELLING</w:t>
+      </w:r>
+      <w:bookmarkEnd w:id="13"/>
+    </w:p>
+    <w:p>
+      <w:pPr>
+        <w:jc w:val="center"/>
+        <w:rPr>
+          <w:sz w:val="24"/>
+          <w:szCs w:val="24"/>
+        </w:rPr>
+      </w:pPr>
+    </w:p>
+    <w:p>
+      <w:pPr>
+        <w:jc w:val="center"/>
+        <w:rPr>
           <w:sz w:val="32"/>
           <w:szCs w:val="32"/>
         </w:rPr>
       </w:pPr>
       <w:r>
         <w:rPr>
-          <w:b/>
-          <w:bCs/>
           <w:sz w:val="32"/>
           <w:szCs w:val="32"/>
         </w:rPr>
-        <w:t>Structures</w:t>
+        <w:t>STRUCTURES</w:t>
       </w:r>
     </w:p>
     <w:p>
@@ -2819,6 +2788,28 @@
           <w:szCs w:val="24"/>
         </w:rPr>
         <w:t>Grid/Graph – A collection of connected nodes. My map will be represented by a graph of nodes.</w:t>
+      </w:r>
+      <w:r>
+        <w:rPr>
+          <w:sz w:val="24"/>
+          <w:szCs w:val="24"/>
+        </w:rPr>
+        <w:br/>
+        <w:t xml:space="preserve">Rectangle </w:t>
+      </w:r>
+      <w:r>
+        <w:rPr>
+          <w:sz w:val="24"/>
+          <w:szCs w:val="24"/>
+        </w:rPr>
+        <w:t>–</w:t>
+      </w:r>
+      <w:r>
+        <w:rPr>
+          <w:sz w:val="24"/>
+          <w:szCs w:val="24"/>
+        </w:rPr>
+        <w:t xml:space="preserve"> Consists of a point and a height and width. Will be used to represent rooms.</w:t>
       </w:r>
       <w:r>
         <w:rPr>
@@ -2859,20 +2850,16 @@
       <w:pPr>
         <w:jc w:val="center"/>
         <w:rPr>
-          <w:b/>
-          <w:bCs/>
           <w:sz w:val="32"/>
           <w:szCs w:val="32"/>
         </w:rPr>
       </w:pPr>
       <w:r>
         <w:rPr>
-          <w:b/>
-          <w:bCs/>
           <w:sz w:val="32"/>
           <w:szCs w:val="32"/>
         </w:rPr>
-        <w:t>Pathfinding</w:t>
+        <w:t>PATHFINDING</w:t>
       </w:r>
     </w:p>
     <w:p>
@@ -8793,24 +8780,11 @@
       </w:pPr>
       <w:r>
         <w:rPr>
-          <w:b/>
-          <w:bCs/>
           <w:sz w:val="32"/>
           <w:szCs w:val="32"/>
         </w:rPr>
-        <w:t>Finite State Machine</w:t>
-      </w:r>
-    </w:p>
-    <w:p>
-      <w:pPr>
-        <w:jc w:val="center"/>
-        <w:rPr>
-          <w:b/>
-          <w:bCs/>
-          <w:sz w:val="32"/>
-          <w:szCs w:val="32"/>
-        </w:rPr>
-      </w:pPr>
+        <w:t>FINITE STATE MACHINE</w:t>
+      </w:r>
     </w:p>
     <w:p>
       <w:pPr>
@@ -8844,7 +8818,7 @@
           <w:szCs w:val="24"/>
         </w:rPr>
         <w:drawing>
-          <wp:inline distT="0" distB="0" distL="0" distR="0" wp14:anchorId="385D079D" wp14:editId="6D5D3691">
+          <wp:inline distT="0" distB="0" distL="0" distR="0" wp14:anchorId="385D079D" wp14:editId="2C2DCB26">
             <wp:extent cx="6645910" cy="4813935"/>
             <wp:effectExtent l="0" t="0" r="2540" b="5715"/>
             <wp:docPr id="1" name="Picture 1"/>
@@ -8896,7 +8870,21 @@
           <w:sz w:val="24"/>
           <w:szCs w:val="24"/>
         </w:rPr>
-        <w:t>This diagram shows a very simple design of how the enemies system may look. It also considers that if the enemies health drops to 0, it will always transition to the dead state which will remove it from the game.</w:t>
+        <w:t xml:space="preserve">This diagram shows a very simple design of how the </w:t>
+      </w:r>
+      <w:r>
+        <w:rPr>
+          <w:sz w:val="24"/>
+          <w:szCs w:val="24"/>
+        </w:rPr>
+        <w:t>enemy’s</w:t>
+      </w:r>
+      <w:r>
+        <w:rPr>
+          <w:sz w:val="24"/>
+          <w:szCs w:val="24"/>
+        </w:rPr>
+        <w:t xml:space="preserve"> system may look. It also considers that if the enemies health drops to 0, it will always transition to the dead state which will remove it from the game.</w:t>
       </w:r>
     </w:p>
     <w:p>
@@ -8934,6 +8922,26 @@
           <w:szCs w:val="24"/>
         </w:rPr>
       </w:pPr>
+    </w:p>
+    <w:p>
+      <w:pPr>
+        <w:tabs>
+          <w:tab w:val="left" w:pos="6285"/>
+        </w:tabs>
+        <w:jc w:val="center"/>
+        <w:rPr>
+          <w:sz w:val="32"/>
+          <w:szCs w:val="32"/>
+        </w:rPr>
+      </w:pPr>
+      <w:r>
+        <w:rPr>
+          <w:sz w:val="32"/>
+          <w:szCs w:val="32"/>
+        </w:rPr>
+        <w:lastRenderedPageBreak/>
+        <w:t>ROOM GENERATION</w:t>
+      </w:r>
     </w:p>
     <w:p>
       <w:pPr>
@@ -8948,15 +8956,6 @@
           <w:szCs w:val="32"/>
         </w:rPr>
       </w:pPr>
-      <w:r>
-        <w:rPr>
-          <w:b/>
-          <w:bCs/>
-          <w:sz w:val="32"/>
-          <w:szCs w:val="32"/>
-        </w:rPr>
-        <w:t>Room Generation</w:t>
-      </w:r>
     </w:p>
     <w:p>
       <w:pPr>
@@ -8965,12 +8964,31 @@
         </w:tabs>
         <w:jc w:val="center"/>
         <w:rPr>
-          <w:b/>
-          <w:bCs/>
-          <w:sz w:val="32"/>
-          <w:szCs w:val="32"/>
-        </w:rPr>
-      </w:pPr>
+          <w:sz w:val="24"/>
+          <w:szCs w:val="24"/>
+        </w:rPr>
+      </w:pPr>
+      <w:r>
+        <w:rPr>
+          <w:sz w:val="24"/>
+          <w:szCs w:val="24"/>
+        </w:rPr>
+        <w:t xml:space="preserve">The map and room generation for my game will incorporate different methods which, together, will create </w:t>
+      </w:r>
+      <w:r>
+        <w:rPr>
+          <w:sz w:val="24"/>
+          <w:szCs w:val="24"/>
+        </w:rPr>
+        <w:t>a map which is ideal for the player.</w:t>
+      </w:r>
+      <w:r>
+        <w:rPr>
+          <w:sz w:val="24"/>
+          <w:szCs w:val="24"/>
+        </w:rPr>
+        <w:t xml:space="preserve"> Each different section of the room generation process adds a different element to the map</w:t>
+      </w:r>
     </w:p>
     <w:p>
       <w:pPr>
@@ -8983,20 +9001,6 @@
           <w:szCs w:val="24"/>
         </w:rPr>
       </w:pPr>
-      <w:r>
-        <w:rPr>
-          <w:sz w:val="24"/>
-          <w:szCs w:val="24"/>
-        </w:rPr>
-        <w:t xml:space="preserve">The map and room generation for my game will incorporate different methods which, together, will create </w:t>
-      </w:r>
-      <w:r>
-        <w:rPr>
-          <w:sz w:val="24"/>
-          <w:szCs w:val="24"/>
-        </w:rPr>
-        <w:t>a map which is ideal for the player.</w:t>
-      </w:r>
     </w:p>
     <w:p>
       <w:pPr>
@@ -9005,10 +9009,17 @@
         </w:tabs>
         <w:jc w:val="center"/>
         <w:rPr>
-          <w:sz w:val="24"/>
-          <w:szCs w:val="24"/>
-        </w:rPr>
-      </w:pPr>
+          <w:sz w:val="28"/>
+          <w:szCs w:val="28"/>
+        </w:rPr>
+      </w:pPr>
+      <w:r>
+        <w:rPr>
+          <w:sz w:val="28"/>
+          <w:szCs w:val="28"/>
+        </w:rPr>
+        <w:t>ROOM PLACEMENT</w:t>
+      </w:r>
     </w:p>
     <w:p>
       <w:pPr>
@@ -9021,6 +9032,69 @@
           <w:szCs w:val="24"/>
         </w:rPr>
       </w:pPr>
+      <w:r>
+        <w:rPr>
+          <w:sz w:val="24"/>
+          <w:szCs w:val="24"/>
+        </w:rPr>
+        <w:t xml:space="preserve">Rooms will be </w:t>
+      </w:r>
+      <w:r>
+        <w:rPr>
+          <w:sz w:val="24"/>
+          <w:szCs w:val="24"/>
+        </w:rPr>
+        <w:t xml:space="preserve">represented within my code as rectangles. When rooms are placed, they </w:t>
+      </w:r>
+      <w:r>
+        <w:rPr>
+          <w:sz w:val="24"/>
+          <w:szCs w:val="24"/>
+        </w:rPr>
+        <w:t>will be</w:t>
+      </w:r>
+      <w:r>
+        <w:rPr>
+          <w:sz w:val="24"/>
+          <w:szCs w:val="24"/>
+        </w:rPr>
+        <w:t xml:space="preserve"> assigned a random </w:t>
+      </w:r>
+      <w:r>
+        <w:rPr>
+          <w:sz w:val="24"/>
+          <w:szCs w:val="24"/>
+        </w:rPr>
+        <w:t>X</w:t>
+      </w:r>
+      <w:r>
+        <w:rPr>
+          <w:sz w:val="24"/>
+          <w:szCs w:val="24"/>
+        </w:rPr>
+        <w:t xml:space="preserve"> and </w:t>
+      </w:r>
+      <w:r>
+        <w:rPr>
+          <w:sz w:val="24"/>
+          <w:szCs w:val="24"/>
+        </w:rPr>
+        <w:t>Y</w:t>
+      </w:r>
+      <w:r>
+        <w:rPr>
+          <w:sz w:val="24"/>
+          <w:szCs w:val="24"/>
+        </w:rPr>
+        <w:t xml:space="preserve"> coordinate in addition to a random height and width.</w:t>
+      </w:r>
+      <w:r>
+        <w:rPr>
+          <w:sz w:val="24"/>
+          <w:szCs w:val="24"/>
+        </w:rPr>
+        <w:t xml:space="preserve"> They will then be compared to all other existing rooms and, if they do not cross another room, they are placed on the map. Using this method to place rooms ensures a random spread of room sizes across the map. It also allows for easy changes to the map and room sizes which could be useful for making harder levels of the game feel more expansive.</w:t>
+      </w:r>
     </w:p>
     <w:p>
       <w:pPr>
@@ -9033,6 +9107,2136 @@
           <w:szCs w:val="24"/>
         </w:rPr>
       </w:pPr>
+      <w:r>
+        <w:rPr>
+          <w:noProof/>
+          <w:color w:val="FFFFFF" w:themeColor="background1"/>
+          <w:sz w:val="24"/>
+          <w:szCs w:val="24"/>
+        </w:rPr>
+        <mc:AlternateContent>
+          <mc:Choice Requires="wps">
+            <w:drawing>
+              <wp:anchor distT="0" distB="0" distL="114300" distR="114300" simplePos="0" relativeHeight="251659264" behindDoc="0" locked="0" layoutInCell="1" allowOverlap="1" wp14:anchorId="74C05BA0" wp14:editId="21DB99E1">
+                <wp:simplePos x="0" y="0"/>
+                <wp:positionH relativeFrom="column">
+                  <wp:posOffset>381000</wp:posOffset>
+                </wp:positionH>
+                <wp:positionV relativeFrom="paragraph">
+                  <wp:posOffset>240665</wp:posOffset>
+                </wp:positionV>
+                <wp:extent cx="3562350" cy="1485900"/>
+                <wp:effectExtent l="19050" t="19050" r="19050" b="19050"/>
+                <wp:wrapNone/>
+                <wp:docPr id="2" name="Rectangle 2"/>
+                <wp:cNvGraphicFramePr/>
+                <a:graphic xmlns:a="http://schemas.openxmlformats.org/drawingml/2006/main">
+                  <a:graphicData uri="http://schemas.microsoft.com/office/word/2010/wordprocessingShape">
+                    <wps:wsp>
+                      <wps:cNvSpPr/>
+                      <wps:spPr>
+                        <a:xfrm>
+                          <a:off x="0" y="0"/>
+                          <a:ext cx="3562350" cy="1485900"/>
+                        </a:xfrm>
+                        <a:prstGeom prst="rect">
+                          <a:avLst/>
+                        </a:prstGeom>
+                        <a:solidFill>
+                          <a:schemeClr val="bg1"/>
+                        </a:solidFill>
+                        <a:ln w="28575">
+                          <a:solidFill>
+                            <a:srgbClr val="FF0000"/>
+                          </a:solidFill>
+                        </a:ln>
+                      </wps:spPr>
+                      <wps:style>
+                        <a:lnRef idx="2">
+                          <a:schemeClr val="accent1">
+                            <a:shade val="15000"/>
+                          </a:schemeClr>
+                        </a:lnRef>
+                        <a:fillRef idx="1">
+                          <a:schemeClr val="accent1"/>
+                        </a:fillRef>
+                        <a:effectRef idx="0">
+                          <a:schemeClr val="accent1"/>
+                        </a:effectRef>
+                        <a:fontRef idx="minor">
+                          <a:schemeClr val="lt1"/>
+                        </a:fontRef>
+                      </wps:style>
+                      <wps:txbx>
+                        <w:txbxContent>
+                          <w:p>
+                            <w:pPr>
+                              <w:jc w:val="center"/>
+                              <w:rPr>
+                                <w:color w:val="000000" w:themeColor="text1"/>
+                              </w:rPr>
+                            </w:pPr>
+                            <w:r>
+                              <w:rPr>
+                                <w:sz w:val="24"/>
+                                <w:szCs w:val="24"/>
+                              </w:rPr>
+                              <w:t>–</w:t>
+                            </w:r>
+                            <w:r>
+                              <w:t>t</w:t>
+                            </w:r>
+                            <w:r>
+                              <w:rPr>
+                                <w:color w:val="000000" w:themeColor="text1"/>
+                              </w:rPr>
+                              <w:t>1</w:t>
+                            </w:r>
+                          </w:p>
+                        </w:txbxContent>
+                      </wps:txbx>
+                      <wps:bodyPr rot="0" spcFirstLastPara="0" vertOverflow="overflow" horzOverflow="overflow" vert="horz" wrap="square" lIns="91440" tIns="45720" rIns="91440" bIns="45720" numCol="1" spcCol="0" rtlCol="0" fromWordArt="0" anchor="ctr" anchorCtr="0" forceAA="0" compatLnSpc="1">
+                        <a:prstTxWarp prst="textNoShape">
+                          <a:avLst/>
+                        </a:prstTxWarp>
+                        <a:noAutofit/>
+                      </wps:bodyPr>
+                    </wps:wsp>
+                  </a:graphicData>
+                </a:graphic>
+                <wp14:sizeRelH relativeFrom="margin">
+                  <wp14:pctWidth>0</wp14:pctWidth>
+                </wp14:sizeRelH>
+                <wp14:sizeRelV relativeFrom="margin">
+                  <wp14:pctHeight>0</wp14:pctHeight>
+                </wp14:sizeRelV>
+              </wp:anchor>
+            </w:drawing>
+          </mc:Choice>
+          <mc:Fallback>
+            <w:pict>
+              <v:rect w14:anchorId="74C05BA0" id="Rectangle 2" o:spid="_x0000_s1026" style="position:absolute;left:0;text-align:left;margin-left:30pt;margin-top:18.95pt;width:280.5pt;height:117pt;z-index:251659264;visibility:visible;mso-wrap-style:square;mso-width-percent:0;mso-height-percent:0;mso-wrap-distance-left:9pt;mso-wrap-distance-top:0;mso-wrap-distance-right:9pt;mso-wrap-distance-bottom:0;mso-position-horizontal:absolute;mso-position-horizontal-relative:text;mso-position-vertical:absolute;mso-position-vertical-relative:text;mso-width-percent:0;mso-height-percent:0;mso-width-relative:margin;mso-height-relative:margin;v-text-anchor:middle" o:gfxdata="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" fillcolor="white [3212]" strokecolor="red" strokeweight="2.25pt">
+                <v:textbox>
+                  <w:txbxContent>
+                    <w:p>
+                      <w:pPr>
+                        <w:jc w:val="center"/>
+                        <w:rPr>
+                          <w:color w:val="000000" w:themeColor="text1"/>
+                        </w:rPr>
+                      </w:pPr>
+                      <w:r>
+                        <w:rPr>
+                          <w:sz w:val="24"/>
+                          <w:szCs w:val="24"/>
+                        </w:rPr>
+                        <w:t>–</w:t>
+                      </w:r>
+                      <w:r>
+                        <w:t>t</w:t>
+                      </w:r>
+                      <w:r>
+                        <w:rPr>
+                          <w:color w:val="000000" w:themeColor="text1"/>
+                        </w:rPr>
+                        <w:t>1</w:t>
+                      </w:r>
+                    </w:p>
+                  </w:txbxContent>
+                </v:textbox>
+              </v:rect>
+            </w:pict>
+          </mc:Fallback>
+        </mc:AlternateContent>
+      </w:r>
+    </w:p>
+    <w:p>
+      <w:pPr>
+        <w:tabs>
+          <w:tab w:val="left" w:pos="6285"/>
+        </w:tabs>
+        <w:jc w:val="center"/>
+        <w:rPr>
+          <w:sz w:val="24"/>
+          <w:szCs w:val="24"/>
+        </w:rPr>
+      </w:pPr>
+    </w:p>
+    <w:p>
+      <w:pPr>
+        <w:tabs>
+          <w:tab w:val="left" w:pos="6285"/>
+        </w:tabs>
+        <w:jc w:val="center"/>
+        <w:rPr>
+          <w:sz w:val="24"/>
+          <w:szCs w:val="24"/>
+        </w:rPr>
+      </w:pPr>
+    </w:p>
+    <w:p>
+      <w:pPr>
+        <w:tabs>
+          <w:tab w:val="left" w:pos="6285"/>
+        </w:tabs>
+        <w:jc w:val="center"/>
+        <w:rPr>
+          <w:sz w:val="24"/>
+          <w:szCs w:val="24"/>
+        </w:rPr>
+      </w:pPr>
+    </w:p>
+    <w:p>
+      <w:pPr>
+        <w:tabs>
+          <w:tab w:val="left" w:pos="6285"/>
+        </w:tabs>
+        <w:jc w:val="center"/>
+        <w:rPr>
+          <w:sz w:val="24"/>
+          <w:szCs w:val="24"/>
+        </w:rPr>
+      </w:pPr>
+    </w:p>
+    <w:p>
+      <w:pPr>
+        <w:tabs>
+          <w:tab w:val="left" w:pos="6285"/>
+        </w:tabs>
+        <w:jc w:val="center"/>
+        <w:rPr>
+          <w:sz w:val="24"/>
+          <w:szCs w:val="24"/>
+        </w:rPr>
+      </w:pPr>
+    </w:p>
+    <w:p>
+      <w:pPr>
+        <w:tabs>
+          <w:tab w:val="left" w:pos="6285"/>
+        </w:tabs>
+        <w:jc w:val="center"/>
+        <w:rPr>
+          <w:sz w:val="24"/>
+          <w:szCs w:val="24"/>
+        </w:rPr>
+      </w:pPr>
+      <w:r>
+        <w:rPr>
+          <w:sz w:val="24"/>
+          <w:szCs w:val="24"/>
+        </w:rPr>
+        <w:t>The game first draws 1 rectangle</w:t>
+      </w:r>
+    </w:p>
+    <w:p>
+      <w:pPr>
+        <w:tabs>
+          <w:tab w:val="left" w:pos="6285"/>
+        </w:tabs>
+        <w:jc w:val="center"/>
+        <w:rPr>
+          <w:sz w:val="24"/>
+          <w:szCs w:val="24"/>
+        </w:rPr>
+      </w:pPr>
+      <w:r>
+        <w:rPr>
+          <w:noProof/>
+          <w:color w:val="FFFFFF" w:themeColor="background1"/>
+          <w:sz w:val="24"/>
+          <w:szCs w:val="24"/>
+        </w:rPr>
+        <mc:AlternateContent>
+          <mc:Choice Requires="wps">
+            <w:drawing>
+              <wp:anchor distT="0" distB="0" distL="114300" distR="114300" simplePos="0" relativeHeight="251661312" behindDoc="0" locked="0" layoutInCell="1" allowOverlap="1" wp14:anchorId="099AF99D" wp14:editId="13DA2EC9">
+                <wp:simplePos x="0" y="0"/>
+                <wp:positionH relativeFrom="column">
+                  <wp:posOffset>409575</wp:posOffset>
+                </wp:positionH>
+                <wp:positionV relativeFrom="paragraph">
+                  <wp:posOffset>95885</wp:posOffset>
+                </wp:positionV>
+                <wp:extent cx="3562350" cy="1485900"/>
+                <wp:effectExtent l="19050" t="19050" r="19050" b="19050"/>
+                <wp:wrapNone/>
+                <wp:docPr id="3" name="Rectangle 3"/>
+                <wp:cNvGraphicFramePr/>
+                <a:graphic xmlns:a="http://schemas.openxmlformats.org/drawingml/2006/main">
+                  <a:graphicData uri="http://schemas.microsoft.com/office/word/2010/wordprocessingShape">
+                    <wps:wsp>
+                      <wps:cNvSpPr/>
+                      <wps:spPr>
+                        <a:xfrm>
+                          <a:off x="0" y="0"/>
+                          <a:ext cx="3562350" cy="1485900"/>
+                        </a:xfrm>
+                        <a:prstGeom prst="rect">
+                          <a:avLst/>
+                        </a:prstGeom>
+                        <a:solidFill>
+                          <a:schemeClr val="bg1"/>
+                        </a:solidFill>
+                        <a:ln w="28575">
+                          <a:solidFill>
+                            <a:srgbClr val="FF0000"/>
+                          </a:solidFill>
+                        </a:ln>
+                      </wps:spPr>
+                      <wps:style>
+                        <a:lnRef idx="2">
+                          <a:schemeClr val="accent1">
+                            <a:shade val="15000"/>
+                          </a:schemeClr>
+                        </a:lnRef>
+                        <a:fillRef idx="1">
+                          <a:schemeClr val="accent1"/>
+                        </a:fillRef>
+                        <a:effectRef idx="0">
+                          <a:schemeClr val="accent1"/>
+                        </a:effectRef>
+                        <a:fontRef idx="minor">
+                          <a:schemeClr val="lt1"/>
+                        </a:fontRef>
+                      </wps:style>
+                      <wps:txbx>
+                        <w:txbxContent>
+                          <w:p>
+                            <w:pPr>
+                              <w:jc w:val="center"/>
+                              <w:rPr>
+                                <w:color w:val="000000" w:themeColor="text1"/>
+                              </w:rPr>
+                            </w:pPr>
+                            <w:r>
+                              <w:rPr>
+                                <w:sz w:val="24"/>
+                                <w:szCs w:val="24"/>
+                              </w:rPr>
+                              <w:t>–</w:t>
+                            </w:r>
+                            <w:r>
+                              <w:t>t</w:t>
+                            </w:r>
+                            <w:r>
+                              <w:rPr>
+                                <w:color w:val="000000" w:themeColor="text1"/>
+                              </w:rPr>
+                              <w:t>1</w:t>
+                            </w:r>
+                          </w:p>
+                        </w:txbxContent>
+                      </wps:txbx>
+                      <wps:bodyPr rot="0" spcFirstLastPara="0" vertOverflow="overflow" horzOverflow="overflow" vert="horz" wrap="square" lIns="91440" tIns="45720" rIns="91440" bIns="45720" numCol="1" spcCol="0" rtlCol="0" fromWordArt="0" anchor="ctr" anchorCtr="0" forceAA="0" compatLnSpc="1">
+                        <a:prstTxWarp prst="textNoShape">
+                          <a:avLst/>
+                        </a:prstTxWarp>
+                        <a:noAutofit/>
+                      </wps:bodyPr>
+                    </wps:wsp>
+                  </a:graphicData>
+                </a:graphic>
+                <wp14:sizeRelH relativeFrom="margin">
+                  <wp14:pctWidth>0</wp14:pctWidth>
+                </wp14:sizeRelH>
+                <wp14:sizeRelV relativeFrom="margin">
+                  <wp14:pctHeight>0</wp14:pctHeight>
+                </wp14:sizeRelV>
+              </wp:anchor>
+            </w:drawing>
+          </mc:Choice>
+          <mc:Fallback>
+            <w:pict>
+              <v:rect w14:anchorId="099AF99D" id="Rectangle 3" o:spid="_x0000_s1027" style="position:absolute;left:0;text-align:left;margin-left:32.25pt;margin-top:7.55pt;width:280.5pt;height:117pt;z-index:251661312;visibility:visible;mso-wrap-style:square;mso-width-percent:0;mso-height-percent:0;mso-wrap-distance-left:9pt;mso-wrap-distance-top:0;mso-wrap-distance-right:9pt;mso-wrap-distance-bottom:0;mso-position-horizontal:absolute;mso-position-horizontal-relative:text;mso-position-vertical:absolute;mso-position-vertical-relative:text;mso-width-percent:0;mso-height-percent:0;mso-width-relative:margin;mso-height-relative:margin;v-text-anchor:middle" o:gfxdata="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" fillcolor="white [3212]" strokecolor="red" strokeweight="2.25pt">
+                <v:textbox>
+                  <w:txbxContent>
+                    <w:p>
+                      <w:pPr>
+                        <w:jc w:val="center"/>
+                        <w:rPr>
+                          <w:color w:val="000000" w:themeColor="text1"/>
+                        </w:rPr>
+                      </w:pPr>
+                      <w:r>
+                        <w:rPr>
+                          <w:sz w:val="24"/>
+                          <w:szCs w:val="24"/>
+                        </w:rPr>
+                        <w:t>–</w:t>
+                      </w:r>
+                      <w:r>
+                        <w:t>t</w:t>
+                      </w:r>
+                      <w:r>
+                        <w:rPr>
+                          <w:color w:val="000000" w:themeColor="text1"/>
+                        </w:rPr>
+                        <w:t>1</w:t>
+                      </w:r>
+                    </w:p>
+                  </w:txbxContent>
+                </v:textbox>
+              </v:rect>
+            </w:pict>
+          </mc:Fallback>
+        </mc:AlternateContent>
+      </w:r>
+    </w:p>
+    <w:p>
+      <w:pPr>
+        <w:tabs>
+          <w:tab w:val="left" w:pos="6285"/>
+        </w:tabs>
+        <w:jc w:val="center"/>
+        <w:rPr>
+          <w:sz w:val="24"/>
+          <w:szCs w:val="24"/>
+        </w:rPr>
+      </w:pPr>
+    </w:p>
+    <w:p>
+      <w:pPr>
+        <w:tabs>
+          <w:tab w:val="left" w:pos="6285"/>
+        </w:tabs>
+        <w:jc w:val="center"/>
+        <w:rPr>
+          <w:sz w:val="24"/>
+          <w:szCs w:val="24"/>
+        </w:rPr>
+      </w:pPr>
+    </w:p>
+    <w:p>
+      <w:pPr>
+        <w:tabs>
+          <w:tab w:val="left" w:pos="6285"/>
+        </w:tabs>
+        <w:jc w:val="center"/>
+        <w:rPr>
+          <w:sz w:val="24"/>
+          <w:szCs w:val="24"/>
+        </w:rPr>
+      </w:pPr>
+    </w:p>
+    <w:p>
+      <w:pPr>
+        <w:tabs>
+          <w:tab w:val="left" w:pos="6285"/>
+        </w:tabs>
+        <w:jc w:val="center"/>
+        <w:rPr>
+          <w:sz w:val="24"/>
+          <w:szCs w:val="24"/>
+        </w:rPr>
+      </w:pPr>
+      <w:r>
+        <w:rPr>
+          <w:noProof/>
+          <w:color w:val="FFFFFF" w:themeColor="background1"/>
+          <w:sz w:val="24"/>
+          <w:szCs w:val="24"/>
+        </w:rPr>
+        <mc:AlternateContent>
+          <mc:Choice Requires="wps">
+            <w:drawing>
+              <wp:anchor distT="0" distB="0" distL="114300" distR="114300" simplePos="0" relativeHeight="251663360" behindDoc="0" locked="0" layoutInCell="1" allowOverlap="1" wp14:anchorId="017A5D07" wp14:editId="7E17C230">
+                <wp:simplePos x="0" y="0"/>
+                <wp:positionH relativeFrom="column">
+                  <wp:posOffset>4200525</wp:posOffset>
+                </wp:positionH>
+                <wp:positionV relativeFrom="paragraph">
+                  <wp:posOffset>27305</wp:posOffset>
+                </wp:positionV>
+                <wp:extent cx="2028825" cy="1200150"/>
+                <wp:effectExtent l="19050" t="19050" r="28575" b="19050"/>
+                <wp:wrapNone/>
+                <wp:docPr id="4" name="Rectangle 4"/>
+                <wp:cNvGraphicFramePr/>
+                <a:graphic xmlns:a="http://schemas.openxmlformats.org/drawingml/2006/main">
+                  <a:graphicData uri="http://schemas.microsoft.com/office/word/2010/wordprocessingShape">
+                    <wps:wsp>
+                      <wps:cNvSpPr/>
+                      <wps:spPr>
+                        <a:xfrm>
+                          <a:off x="0" y="0"/>
+                          <a:ext cx="2028825" cy="1200150"/>
+                        </a:xfrm>
+                        <a:prstGeom prst="rect">
+                          <a:avLst/>
+                        </a:prstGeom>
+                        <a:solidFill>
+                          <a:schemeClr val="bg1"/>
+                        </a:solidFill>
+                        <a:ln w="28575">
+                          <a:solidFill>
+                            <a:srgbClr val="FF0000"/>
+                          </a:solidFill>
+                        </a:ln>
+                      </wps:spPr>
+                      <wps:style>
+                        <a:lnRef idx="2">
+                          <a:schemeClr val="accent1">
+                            <a:shade val="15000"/>
+                          </a:schemeClr>
+                        </a:lnRef>
+                        <a:fillRef idx="1">
+                          <a:schemeClr val="accent1"/>
+                        </a:fillRef>
+                        <a:effectRef idx="0">
+                          <a:schemeClr val="accent1"/>
+                        </a:effectRef>
+                        <a:fontRef idx="minor">
+                          <a:schemeClr val="lt1"/>
+                        </a:fontRef>
+                      </wps:style>
+                      <wps:txbx>
+                        <w:txbxContent>
+                          <w:p>
+                            <w:pPr>
+                              <w:jc w:val="center"/>
+                            </w:pPr>
+                            <w:r>
+                              <w:rPr>
+                                <w:sz w:val="24"/>
+                                <w:szCs w:val="24"/>
+                              </w:rPr>
+                              <w:t>–</w:t>
+                            </w:r>
+                            <w:r>
+                              <w:rPr>
+                                <w:color w:val="000000" w:themeColor="text1"/>
+                                <w:sz w:val="24"/>
+                                <w:szCs w:val="24"/>
+                              </w:rPr>
+                              <w:t>2</w:t>
+                            </w:r>
+                            <w:r>
+                              <w:t>t</w:t>
+                            </w:r>
+                          </w:p>
+                        </w:txbxContent>
+                      </wps:txbx>
+                      <wps:bodyPr rot="0" spcFirstLastPara="0" vertOverflow="overflow" horzOverflow="overflow" vert="horz" wrap="square" lIns="91440" tIns="45720" rIns="91440" bIns="45720" numCol="1" spcCol="0" rtlCol="0" fromWordArt="0" anchor="ctr" anchorCtr="0" forceAA="0" compatLnSpc="1">
+                        <a:prstTxWarp prst="textNoShape">
+                          <a:avLst/>
+                        </a:prstTxWarp>
+                        <a:noAutofit/>
+                      </wps:bodyPr>
+                    </wps:wsp>
+                  </a:graphicData>
+                </a:graphic>
+                <wp14:sizeRelH relativeFrom="margin">
+                  <wp14:pctWidth>0</wp14:pctWidth>
+                </wp14:sizeRelH>
+                <wp14:sizeRelV relativeFrom="margin">
+                  <wp14:pctHeight>0</wp14:pctHeight>
+                </wp14:sizeRelV>
+              </wp:anchor>
+            </w:drawing>
+          </mc:Choice>
+          <mc:Fallback>
+            <w:pict>
+              <v:rect w14:anchorId="017A5D07" id="Rectangle 4" o:spid="_x0000_s1028" style="position:absolute;left:0;text-align:left;margin-left:330.75pt;margin-top:2.15pt;width:159.75pt;height:94.5pt;z-index:251663360;visibility:visible;mso-wrap-style:square;mso-width-percent:0;mso-height-percent:0;mso-wrap-distance-left:9pt;mso-wrap-distance-top:0;mso-wrap-distance-right:9pt;mso-wrap-distance-bottom:0;mso-position-horizontal:absolute;mso-position-horizontal-relative:text;mso-position-vertical:absolute;mso-position-vertical-relative:text;mso-width-percent:0;mso-height-percent:0;mso-width-relative:margin;mso-height-relative:margin;v-text-anchor:middle" o:gfxdata="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" fillcolor="white [3212]" strokecolor="red" strokeweight="2.25pt">
+                <v:textbox>
+                  <w:txbxContent>
+                    <w:p>
+                      <w:pPr>
+                        <w:jc w:val="center"/>
+                      </w:pPr>
+                      <w:r>
+                        <w:rPr>
+                          <w:sz w:val="24"/>
+                          <w:szCs w:val="24"/>
+                        </w:rPr>
+                        <w:t>–</w:t>
+                      </w:r>
+                      <w:r>
+                        <w:rPr>
+                          <w:color w:val="000000" w:themeColor="text1"/>
+                          <w:sz w:val="24"/>
+                          <w:szCs w:val="24"/>
+                        </w:rPr>
+                        <w:t>2</w:t>
+                      </w:r>
+                      <w:r>
+                        <w:t>t</w:t>
+                      </w:r>
+                    </w:p>
+                  </w:txbxContent>
+                </v:textbox>
+              </v:rect>
+            </w:pict>
+          </mc:Fallback>
+        </mc:AlternateContent>
+      </w:r>
+    </w:p>
+    <w:p>
+      <w:pPr>
+        <w:tabs>
+          <w:tab w:val="left" w:pos="6285"/>
+        </w:tabs>
+        <w:jc w:val="center"/>
+        <w:rPr>
+          <w:sz w:val="24"/>
+          <w:szCs w:val="24"/>
+        </w:rPr>
+      </w:pPr>
+    </w:p>
+    <w:p>
+      <w:pPr>
+        <w:tabs>
+          <w:tab w:val="left" w:pos="6285"/>
+        </w:tabs>
+        <w:jc w:val="center"/>
+        <w:rPr>
+          <w:sz w:val="24"/>
+          <w:szCs w:val="24"/>
+        </w:rPr>
+      </w:pPr>
+    </w:p>
+    <w:p>
+      <w:pPr>
+        <w:tabs>
+          <w:tab w:val="left" w:pos="6285"/>
+        </w:tabs>
+        <w:jc w:val="center"/>
+        <w:rPr>
+          <w:sz w:val="24"/>
+          <w:szCs w:val="24"/>
+        </w:rPr>
+      </w:pPr>
+    </w:p>
+    <w:p>
+      <w:pPr>
+        <w:tabs>
+          <w:tab w:val="left" w:pos="6285"/>
+        </w:tabs>
+        <w:jc w:val="center"/>
+        <w:rPr>
+          <w:sz w:val="24"/>
+          <w:szCs w:val="24"/>
+        </w:rPr>
+      </w:pPr>
+    </w:p>
+    <w:p>
+      <w:pPr>
+        <w:tabs>
+          <w:tab w:val="left" w:pos="6285"/>
+        </w:tabs>
+        <w:jc w:val="center"/>
+        <w:rPr>
+          <w:sz w:val="24"/>
+          <w:szCs w:val="24"/>
+        </w:rPr>
+      </w:pPr>
+      <w:r>
+        <w:rPr>
+          <w:sz w:val="24"/>
+          <w:szCs w:val="24"/>
+        </w:rPr>
+        <w:t>Rectangle 2 will be accepted as it doesn’t cross into rectangle 1</w:t>
+      </w:r>
+    </w:p>
+    <w:p>
+      <w:pPr>
+        <w:tabs>
+          <w:tab w:val="left" w:pos="6285"/>
+        </w:tabs>
+        <w:jc w:val="center"/>
+        <w:rPr>
+          <w:sz w:val="24"/>
+          <w:szCs w:val="24"/>
+        </w:rPr>
+      </w:pPr>
+    </w:p>
+    <w:p>
+      <w:pPr>
+        <w:tabs>
+          <w:tab w:val="left" w:pos="6285"/>
+        </w:tabs>
+        <w:jc w:val="center"/>
+        <w:rPr>
+          <w:sz w:val="24"/>
+          <w:szCs w:val="24"/>
+        </w:rPr>
+      </w:pPr>
+    </w:p>
+    <w:p>
+      <w:pPr>
+        <w:tabs>
+          <w:tab w:val="left" w:pos="6285"/>
+        </w:tabs>
+        <w:jc w:val="center"/>
+        <w:rPr>
+          <w:sz w:val="24"/>
+          <w:szCs w:val="24"/>
+        </w:rPr>
+      </w:pPr>
+    </w:p>
+    <w:p>
+      <w:pPr>
+        <w:tabs>
+          <w:tab w:val="left" w:pos="6285"/>
+        </w:tabs>
+        <w:jc w:val="center"/>
+        <w:rPr>
+          <w:sz w:val="24"/>
+          <w:szCs w:val="24"/>
+        </w:rPr>
+      </w:pPr>
+      <w:r>
+        <w:rPr>
+          <w:noProof/>
+          <w:color w:val="FFFFFF" w:themeColor="background1"/>
+          <w:sz w:val="24"/>
+          <w:szCs w:val="24"/>
+        </w:rPr>
+        <w:lastRenderedPageBreak/>
+        <mc:AlternateContent>
+          <mc:Choice Requires="wps">
+            <w:drawing>
+              <wp:anchor distT="0" distB="0" distL="114300" distR="114300" simplePos="0" relativeHeight="251665408" behindDoc="0" locked="0" layoutInCell="1" allowOverlap="1" wp14:anchorId="07359C17" wp14:editId="31EC38B6">
+                <wp:simplePos x="0" y="0"/>
+                <wp:positionH relativeFrom="margin">
+                  <wp:posOffset>342900</wp:posOffset>
+                </wp:positionH>
+                <wp:positionV relativeFrom="paragraph">
+                  <wp:posOffset>0</wp:posOffset>
+                </wp:positionV>
+                <wp:extent cx="3562350" cy="1495425"/>
+                <wp:effectExtent l="19050" t="19050" r="19050" b="28575"/>
+                <wp:wrapNone/>
+                <wp:docPr id="5" name="Rectangle 5"/>
+                <wp:cNvGraphicFramePr/>
+                <a:graphic xmlns:a="http://schemas.openxmlformats.org/drawingml/2006/main">
+                  <a:graphicData uri="http://schemas.microsoft.com/office/word/2010/wordprocessingShape">
+                    <wps:wsp>
+                      <wps:cNvSpPr/>
+                      <wps:spPr>
+                        <a:xfrm>
+                          <a:off x="0" y="0"/>
+                          <a:ext cx="3562350" cy="1495425"/>
+                        </a:xfrm>
+                        <a:prstGeom prst="rect">
+                          <a:avLst/>
+                        </a:prstGeom>
+                        <a:solidFill>
+                          <a:schemeClr val="bg1"/>
+                        </a:solidFill>
+                        <a:ln w="28575">
+                          <a:solidFill>
+                            <a:srgbClr val="FF0000"/>
+                          </a:solidFill>
+                        </a:ln>
+                      </wps:spPr>
+                      <wps:style>
+                        <a:lnRef idx="2">
+                          <a:schemeClr val="accent1">
+                            <a:shade val="15000"/>
+                          </a:schemeClr>
+                        </a:lnRef>
+                        <a:fillRef idx="1">
+                          <a:schemeClr val="accent1"/>
+                        </a:fillRef>
+                        <a:effectRef idx="0">
+                          <a:schemeClr val="accent1"/>
+                        </a:effectRef>
+                        <a:fontRef idx="minor">
+                          <a:schemeClr val="lt1"/>
+                        </a:fontRef>
+                      </wps:style>
+                      <wps:txbx>
+                        <w:txbxContent>
+                          <w:p>
+                            <w:pPr>
+                              <w:jc w:val="center"/>
+                              <w:rPr>
+                                <w:color w:val="000000" w:themeColor="text1"/>
+                              </w:rPr>
+                            </w:pPr>
+                            <w:r>
+                              <w:rPr>
+                                <w:sz w:val="24"/>
+                                <w:szCs w:val="24"/>
+                              </w:rPr>
+                              <w:t>–</w:t>
+                            </w:r>
+                            <w:r>
+                              <w:t>t</w:t>
+                            </w:r>
+                            <w:r>
+                              <w:rPr>
+                                <w:color w:val="000000" w:themeColor="text1"/>
+                              </w:rPr>
+                              <w:t>1</w:t>
+                            </w:r>
+                          </w:p>
+                        </w:txbxContent>
+                      </wps:txbx>
+                      <wps:bodyPr rot="0" spcFirstLastPara="0" vertOverflow="overflow" horzOverflow="overflow" vert="horz" wrap="square" lIns="91440" tIns="45720" rIns="91440" bIns="45720" numCol="1" spcCol="0" rtlCol="0" fromWordArt="0" anchor="ctr" anchorCtr="0" forceAA="0" compatLnSpc="1">
+                        <a:prstTxWarp prst="textNoShape">
+                          <a:avLst/>
+                        </a:prstTxWarp>
+                        <a:noAutofit/>
+                      </wps:bodyPr>
+                    </wps:wsp>
+                  </a:graphicData>
+                </a:graphic>
+                <wp14:sizeRelH relativeFrom="margin">
+                  <wp14:pctWidth>0</wp14:pctWidth>
+                </wp14:sizeRelH>
+                <wp14:sizeRelV relativeFrom="margin">
+                  <wp14:pctHeight>0</wp14:pctHeight>
+                </wp14:sizeRelV>
+              </wp:anchor>
+            </w:drawing>
+          </mc:Choice>
+          <mc:Fallback>
+            <w:pict>
+              <v:rect w14:anchorId="07359C17" id="Rectangle 5" o:spid="_x0000_s1029" style="position:absolute;left:0;text-align:left;margin-left:27pt;margin-top:0;width:280.5pt;height:117.75pt;z-index:251665408;visibility:visible;mso-wrap-style:square;mso-width-percent:0;mso-height-percent:0;mso-wrap-distance-left:9pt;mso-wrap-distance-top:0;mso-wrap-distance-right:9pt;mso-wrap-distance-bottom:0;mso-position-horizontal:absolute;mso-position-horizontal-relative:margin;mso-position-vertical:absolute;mso-position-vertical-relative:text;mso-width-percent:0;mso-height-percent:0;mso-width-relative:margin;mso-height-relative:margin;v-text-anchor:middle" o:gfxdata="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" fillcolor="white [3212]" strokecolor="red" strokeweight="2.25pt">
+                <v:textbox>
+                  <w:txbxContent>
+                    <w:p>
+                      <w:pPr>
+                        <w:jc w:val="center"/>
+                        <w:rPr>
+                          <w:color w:val="000000" w:themeColor="text1"/>
+                        </w:rPr>
+                      </w:pPr>
+                      <w:r>
+                        <w:rPr>
+                          <w:sz w:val="24"/>
+                          <w:szCs w:val="24"/>
+                        </w:rPr>
+                        <w:t>–</w:t>
+                      </w:r>
+                      <w:r>
+                        <w:t>t</w:t>
+                      </w:r>
+                      <w:r>
+                        <w:rPr>
+                          <w:color w:val="000000" w:themeColor="text1"/>
+                        </w:rPr>
+                        <w:t>1</w:t>
+                      </w:r>
+                    </w:p>
+                  </w:txbxContent>
+                </v:textbox>
+                <w10:wrap anchorx="margin"/>
+              </v:rect>
+            </w:pict>
+          </mc:Fallback>
+        </mc:AlternateContent>
+      </w:r>
+    </w:p>
+    <w:p>
+      <w:pPr>
+        <w:tabs>
+          <w:tab w:val="left" w:pos="6285"/>
+        </w:tabs>
+        <w:jc w:val="center"/>
+        <w:rPr>
+          <w:sz w:val="24"/>
+          <w:szCs w:val="24"/>
+        </w:rPr>
+      </w:pPr>
+    </w:p>
+    <w:p>
+      <w:pPr>
+        <w:tabs>
+          <w:tab w:val="left" w:pos="6285"/>
+        </w:tabs>
+        <w:jc w:val="center"/>
+        <w:rPr>
+          <w:sz w:val="24"/>
+          <w:szCs w:val="24"/>
+        </w:rPr>
+      </w:pPr>
+    </w:p>
+    <w:p>
+      <w:pPr>
+        <w:tabs>
+          <w:tab w:val="left" w:pos="6285"/>
+        </w:tabs>
+        <w:jc w:val="center"/>
+        <w:rPr>
+          <w:sz w:val="24"/>
+          <w:szCs w:val="24"/>
+        </w:rPr>
+      </w:pPr>
+      <w:r>
+        <w:rPr>
+          <w:noProof/>
+          <w:color w:val="FFFFFF" w:themeColor="background1"/>
+          <w:sz w:val="24"/>
+          <w:szCs w:val="24"/>
+        </w:rPr>
+        <mc:AlternateContent>
+          <mc:Choice Requires="wps">
+            <w:drawing>
+              <wp:anchor distT="0" distB="0" distL="114300" distR="114300" simplePos="0" relativeHeight="251667456" behindDoc="0" locked="0" layoutInCell="1" allowOverlap="1" wp14:anchorId="454B7645" wp14:editId="521FB51D">
+                <wp:simplePos x="0" y="0"/>
+                <wp:positionH relativeFrom="column">
+                  <wp:posOffset>4114800</wp:posOffset>
+                </wp:positionH>
+                <wp:positionV relativeFrom="paragraph">
+                  <wp:posOffset>91440</wp:posOffset>
+                </wp:positionV>
+                <wp:extent cx="1924050" cy="1400175"/>
+                <wp:effectExtent l="19050" t="19050" r="19050" b="28575"/>
+                <wp:wrapNone/>
+                <wp:docPr id="6" name="Rectangle 6"/>
+                <wp:cNvGraphicFramePr/>
+                <a:graphic xmlns:a="http://schemas.openxmlformats.org/drawingml/2006/main">
+                  <a:graphicData uri="http://schemas.microsoft.com/office/word/2010/wordprocessingShape">
+                    <wps:wsp>
+                      <wps:cNvSpPr/>
+                      <wps:spPr>
+                        <a:xfrm>
+                          <a:off x="0" y="0"/>
+                          <a:ext cx="1924050" cy="1400175"/>
+                        </a:xfrm>
+                        <a:prstGeom prst="rect">
+                          <a:avLst/>
+                        </a:prstGeom>
+                        <a:solidFill>
+                          <a:schemeClr val="bg1"/>
+                        </a:solidFill>
+                        <a:ln w="28575">
+                          <a:solidFill>
+                            <a:srgbClr val="FF0000"/>
+                          </a:solidFill>
+                        </a:ln>
+                      </wps:spPr>
+                      <wps:style>
+                        <a:lnRef idx="2">
+                          <a:schemeClr val="accent1">
+                            <a:shade val="15000"/>
+                          </a:schemeClr>
+                        </a:lnRef>
+                        <a:fillRef idx="1">
+                          <a:schemeClr val="accent1"/>
+                        </a:fillRef>
+                        <a:effectRef idx="0">
+                          <a:schemeClr val="accent1"/>
+                        </a:effectRef>
+                        <a:fontRef idx="minor">
+                          <a:schemeClr val="lt1"/>
+                        </a:fontRef>
+                      </wps:style>
+                      <wps:txbx>
+                        <w:txbxContent>
+                          <w:p>
+                            <w:pPr>
+                              <w:jc w:val="center"/>
+                              <w:rPr>
+                                <w:color w:val="000000" w:themeColor="text1"/>
+                              </w:rPr>
+                            </w:pPr>
+                            <w:r>
+                              <w:rPr>
+                                <w:sz w:val="24"/>
+                                <w:szCs w:val="24"/>
+                              </w:rPr>
+                              <w:t>–</w:t>
+                            </w:r>
+                            <w:r>
+                              <w:t>t</w:t>
+                            </w:r>
+                            <w:r>
+                              <w:rPr>
+                                <w:color w:val="000000" w:themeColor="text1"/>
+                              </w:rPr>
+                              <w:t>2</w:t>
+                            </w:r>
+                          </w:p>
+                        </w:txbxContent>
+                      </wps:txbx>
+                      <wps:bodyPr rot="0" spcFirstLastPara="0" vertOverflow="overflow" horzOverflow="overflow" vert="horz" wrap="square" lIns="91440" tIns="45720" rIns="91440" bIns="45720" numCol="1" spcCol="0" rtlCol="0" fromWordArt="0" anchor="ctr" anchorCtr="0" forceAA="0" compatLnSpc="1">
+                        <a:prstTxWarp prst="textNoShape">
+                          <a:avLst/>
+                        </a:prstTxWarp>
+                        <a:noAutofit/>
+                      </wps:bodyPr>
+                    </wps:wsp>
+                  </a:graphicData>
+                </a:graphic>
+                <wp14:sizeRelH relativeFrom="margin">
+                  <wp14:pctWidth>0</wp14:pctWidth>
+                </wp14:sizeRelH>
+                <wp14:sizeRelV relativeFrom="margin">
+                  <wp14:pctHeight>0</wp14:pctHeight>
+                </wp14:sizeRelV>
+              </wp:anchor>
+            </w:drawing>
+          </mc:Choice>
+          <mc:Fallback>
+            <w:pict>
+              <v:rect w14:anchorId="454B7645" id="Rectangle 6" o:spid="_x0000_s1030" style="position:absolute;left:0;text-align:left;margin-left:324pt;margin-top:7.2pt;width:151.5pt;height:110.25pt;z-index:251667456;visibility:visible;mso-wrap-style:square;mso-width-percent:0;mso-height-percent:0;mso-wrap-distance-left:9pt;mso-wrap-distance-top:0;mso-wrap-distance-right:9pt;mso-wrap-distance-bottom:0;mso-position-horizontal:absolute;mso-position-horizontal-relative:text;mso-position-vertical:absolute;mso-position-vertical-relative:text;mso-width-percent:0;mso-height-percent:0;mso-width-relative:margin;mso-height-relative:margin;v-text-anchor:middle" o:gfxdata="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" fillcolor="white [3212]" strokecolor="red" strokeweight="2.25pt">
+                <v:textbox>
+                  <w:txbxContent>
+                    <w:p>
+                      <w:pPr>
+                        <w:jc w:val="center"/>
+                        <w:rPr>
+                          <w:color w:val="000000" w:themeColor="text1"/>
+                        </w:rPr>
+                      </w:pPr>
+                      <w:r>
+                        <w:rPr>
+                          <w:sz w:val="24"/>
+                          <w:szCs w:val="24"/>
+                        </w:rPr>
+                        <w:t>–</w:t>
+                      </w:r>
+                      <w:r>
+                        <w:t>t</w:t>
+                      </w:r>
+                      <w:r>
+                        <w:rPr>
+                          <w:color w:val="000000" w:themeColor="text1"/>
+                        </w:rPr>
+                        <w:t>2</w:t>
+                      </w:r>
+                    </w:p>
+                  </w:txbxContent>
+                </v:textbox>
+              </v:rect>
+            </w:pict>
+          </mc:Fallback>
+        </mc:AlternateContent>
+      </w:r>
+    </w:p>
+    <w:p>
+      <w:pPr>
+        <w:tabs>
+          <w:tab w:val="left" w:pos="6285"/>
+        </w:tabs>
+        <w:jc w:val="center"/>
+        <w:rPr>
+          <w:sz w:val="24"/>
+          <w:szCs w:val="24"/>
+        </w:rPr>
+      </w:pPr>
+      <w:r>
+        <w:rPr>
+          <w:noProof/>
+          <w:color w:val="FFFFFF" w:themeColor="background1"/>
+          <w:sz w:val="24"/>
+          <w:szCs w:val="24"/>
+        </w:rPr>
+        <mc:AlternateContent>
+          <mc:Choice Requires="wps">
+            <w:drawing>
+              <wp:anchor distT="0" distB="0" distL="114300" distR="114300" simplePos="0" relativeHeight="251669504" behindDoc="0" locked="0" layoutInCell="1" allowOverlap="1" wp14:anchorId="25B57900" wp14:editId="23189EA9">
+                <wp:simplePos x="0" y="0"/>
+                <wp:positionH relativeFrom="column">
+                  <wp:posOffset>542925</wp:posOffset>
+                </wp:positionH>
+                <wp:positionV relativeFrom="paragraph">
+                  <wp:posOffset>32385</wp:posOffset>
+                </wp:positionV>
+                <wp:extent cx="1724025" cy="1876425"/>
+                <wp:effectExtent l="19050" t="19050" r="28575" b="28575"/>
+                <wp:wrapNone/>
+                <wp:docPr id="7" name="Rectangle 7"/>
+                <wp:cNvGraphicFramePr/>
+                <a:graphic xmlns:a="http://schemas.openxmlformats.org/drawingml/2006/main">
+                  <a:graphicData uri="http://schemas.microsoft.com/office/word/2010/wordprocessingShape">
+                    <wps:wsp>
+                      <wps:cNvSpPr/>
+                      <wps:spPr>
+                        <a:xfrm>
+                          <a:off x="0" y="0"/>
+                          <a:ext cx="1724025" cy="1876425"/>
+                        </a:xfrm>
+                        <a:prstGeom prst="rect">
+                          <a:avLst/>
+                        </a:prstGeom>
+                        <a:solidFill>
+                          <a:schemeClr val="bg1"/>
+                        </a:solidFill>
+                        <a:ln w="28575">
+                          <a:solidFill>
+                            <a:srgbClr val="FF0000"/>
+                          </a:solidFill>
+                        </a:ln>
+                      </wps:spPr>
+                      <wps:style>
+                        <a:lnRef idx="2">
+                          <a:schemeClr val="accent1">
+                            <a:shade val="15000"/>
+                          </a:schemeClr>
+                        </a:lnRef>
+                        <a:fillRef idx="1">
+                          <a:schemeClr val="accent1"/>
+                        </a:fillRef>
+                        <a:effectRef idx="0">
+                          <a:schemeClr val="accent1"/>
+                        </a:effectRef>
+                        <a:fontRef idx="minor">
+                          <a:schemeClr val="lt1"/>
+                        </a:fontRef>
+                      </wps:style>
+                      <wps:txbx>
+                        <w:txbxContent>
+                          <w:p>
+                            <w:pPr>
+                              <w:jc w:val="center"/>
+                              <w:rPr>
+                                <w:color w:val="000000" w:themeColor="text1"/>
+                              </w:rPr>
+                            </w:pPr>
+                            <w:r>
+                              <w:rPr>
+                                <w:sz w:val="24"/>
+                                <w:szCs w:val="24"/>
+                              </w:rPr>
+                              <w:t>–</w:t>
+                            </w:r>
+                            <w:r>
+                              <w:t>t</w:t>
+                            </w:r>
+                            <w:r>
+                              <w:rPr>
+                                <w:color w:val="000000" w:themeColor="text1"/>
+                              </w:rPr>
+                              <w:t>3</w:t>
+                            </w:r>
+                          </w:p>
+                        </w:txbxContent>
+                      </wps:txbx>
+                      <wps:bodyPr rot="0" spcFirstLastPara="0" vertOverflow="overflow" horzOverflow="overflow" vert="horz" wrap="square" lIns="91440" tIns="45720" rIns="91440" bIns="45720" numCol="1" spcCol="0" rtlCol="0" fromWordArt="0" anchor="ctr" anchorCtr="0" forceAA="0" compatLnSpc="1">
+                        <a:prstTxWarp prst="textNoShape">
+                          <a:avLst/>
+                        </a:prstTxWarp>
+                        <a:noAutofit/>
+                      </wps:bodyPr>
+                    </wps:wsp>
+                  </a:graphicData>
+                </a:graphic>
+                <wp14:sizeRelH relativeFrom="margin">
+                  <wp14:pctWidth>0</wp14:pctWidth>
+                </wp14:sizeRelH>
+                <wp14:sizeRelV relativeFrom="margin">
+                  <wp14:pctHeight>0</wp14:pctHeight>
+                </wp14:sizeRelV>
+              </wp:anchor>
+            </w:drawing>
+          </mc:Choice>
+          <mc:Fallback>
+            <w:pict>
+              <v:rect w14:anchorId="25B57900" id="Rectangle 7" o:spid="_x0000_s1031" style="position:absolute;left:0;text-align:left;margin-left:42.75pt;margin-top:2.55pt;width:135.75pt;height:147.75pt;z-index:251669504;visibility:visible;mso-wrap-style:square;mso-width-percent:0;mso-height-percent:0;mso-wrap-distance-left:9pt;mso-wrap-distance-top:0;mso-wrap-distance-right:9pt;mso-wrap-distance-bottom:0;mso-position-horizontal:absolute;mso-position-horizontal-relative:text;mso-position-vertical:absolute;mso-position-vertical-relative:text;mso-width-percent:0;mso-height-percent:0;mso-width-relative:margin;mso-height-relative:margin;v-text-anchor:middle" o:gfxdata="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" fillcolor="white [3212]" strokecolor="red" strokeweight="2.25pt">
+                <v:textbox>
+                  <w:txbxContent>
+                    <w:p>
+                      <w:pPr>
+                        <w:jc w:val="center"/>
+                        <w:rPr>
+                          <w:color w:val="000000" w:themeColor="text1"/>
+                        </w:rPr>
+                      </w:pPr>
+                      <w:r>
+                        <w:rPr>
+                          <w:sz w:val="24"/>
+                          <w:szCs w:val="24"/>
+                        </w:rPr>
+                        <w:t>–</w:t>
+                      </w:r>
+                      <w:r>
+                        <w:t>t</w:t>
+                      </w:r>
+                      <w:r>
+                        <w:rPr>
+                          <w:color w:val="000000" w:themeColor="text1"/>
+                        </w:rPr>
+                        <w:t>3</w:t>
+                      </w:r>
+                    </w:p>
+                  </w:txbxContent>
+                </v:textbox>
+              </v:rect>
+            </w:pict>
+          </mc:Fallback>
+        </mc:AlternateContent>
+      </w:r>
+    </w:p>
+    <w:p>
+      <w:pPr>
+        <w:tabs>
+          <w:tab w:val="left" w:pos="6285"/>
+        </w:tabs>
+        <w:jc w:val="center"/>
+        <w:rPr>
+          <w:sz w:val="24"/>
+          <w:szCs w:val="24"/>
+        </w:rPr>
+      </w:pPr>
+    </w:p>
+    <w:p>
+      <w:pPr>
+        <w:tabs>
+          <w:tab w:val="left" w:pos="6285"/>
+        </w:tabs>
+        <w:jc w:val="center"/>
+        <w:rPr>
+          <w:sz w:val="24"/>
+          <w:szCs w:val="24"/>
+        </w:rPr>
+      </w:pPr>
+    </w:p>
+    <w:p>
+      <w:pPr>
+        <w:tabs>
+          <w:tab w:val="left" w:pos="6285"/>
+        </w:tabs>
+        <w:jc w:val="center"/>
+        <w:rPr>
+          <w:sz w:val="24"/>
+          <w:szCs w:val="24"/>
+        </w:rPr>
+      </w:pPr>
+    </w:p>
+    <w:p>
+      <w:pPr>
+        <w:tabs>
+          <w:tab w:val="left" w:pos="6285"/>
+        </w:tabs>
+        <w:jc w:val="center"/>
+        <w:rPr>
+          <w:sz w:val="24"/>
+          <w:szCs w:val="24"/>
+        </w:rPr>
+      </w:pPr>
+    </w:p>
+    <w:p>
+      <w:pPr>
+        <w:tabs>
+          <w:tab w:val="left" w:pos="6285"/>
+        </w:tabs>
+        <w:jc w:val="center"/>
+        <w:rPr>
+          <w:sz w:val="24"/>
+          <w:szCs w:val="24"/>
+        </w:rPr>
+      </w:pPr>
+    </w:p>
+    <w:p>
+      <w:pPr>
+        <w:tabs>
+          <w:tab w:val="left" w:pos="6285"/>
+        </w:tabs>
+        <w:jc w:val="center"/>
+        <w:rPr>
+          <w:sz w:val="24"/>
+          <w:szCs w:val="24"/>
+        </w:rPr>
+      </w:pPr>
+    </w:p>
+    <w:p>
+      <w:pPr>
+        <w:tabs>
+          <w:tab w:val="left" w:pos="6285"/>
+        </w:tabs>
+        <w:jc w:val="center"/>
+        <w:rPr>
+          <w:sz w:val="24"/>
+          <w:szCs w:val="24"/>
+        </w:rPr>
+      </w:pPr>
+      <w:r>
+        <w:rPr>
+          <w:sz w:val="24"/>
+          <w:szCs w:val="24"/>
+        </w:rPr>
+        <w:t>Rectangle 3 will be rejected as it crosses rectangle 1</w:t>
+      </w:r>
+    </w:p>
+    <w:p>
+      <w:pPr>
+        <w:tabs>
+          <w:tab w:val="left" w:pos="6285"/>
+        </w:tabs>
+        <w:jc w:val="center"/>
+        <w:rPr>
+          <w:sz w:val="24"/>
+          <w:szCs w:val="24"/>
+        </w:rPr>
+      </w:pPr>
+      <w:r>
+        <w:rPr>
+          <w:noProof/>
+          <w:color w:val="FFFFFF" w:themeColor="background1"/>
+          <w:sz w:val="24"/>
+          <w:szCs w:val="24"/>
+        </w:rPr>
+        <mc:AlternateContent>
+          <mc:Choice Requires="wps">
+            <w:drawing>
+              <wp:anchor distT="0" distB="0" distL="114300" distR="114300" simplePos="0" relativeHeight="251675648" behindDoc="0" locked="0" layoutInCell="1" allowOverlap="1" wp14:anchorId="3BE162E8" wp14:editId="60C78FBE">
+                <wp:simplePos x="0" y="0"/>
+                <wp:positionH relativeFrom="margin">
+                  <wp:align>right</wp:align>
+                </wp:positionH>
+                <wp:positionV relativeFrom="paragraph">
+                  <wp:posOffset>32385</wp:posOffset>
+                </wp:positionV>
+                <wp:extent cx="2133600" cy="847725"/>
+                <wp:effectExtent l="19050" t="19050" r="19050" b="28575"/>
+                <wp:wrapNone/>
+                <wp:docPr id="10" name="Rectangle 10"/>
+                <wp:cNvGraphicFramePr/>
+                <a:graphic xmlns:a="http://schemas.openxmlformats.org/drawingml/2006/main">
+                  <a:graphicData uri="http://schemas.microsoft.com/office/word/2010/wordprocessingShape">
+                    <wps:wsp>
+                      <wps:cNvSpPr/>
+                      <wps:spPr>
+                        <a:xfrm>
+                          <a:off x="0" y="0"/>
+                          <a:ext cx="2133600" cy="847725"/>
+                        </a:xfrm>
+                        <a:prstGeom prst="rect">
+                          <a:avLst/>
+                        </a:prstGeom>
+                        <a:solidFill>
+                          <a:schemeClr val="bg1"/>
+                        </a:solidFill>
+                        <a:ln w="28575">
+                          <a:solidFill>
+                            <a:srgbClr val="FF0000"/>
+                          </a:solidFill>
+                        </a:ln>
+                      </wps:spPr>
+                      <wps:style>
+                        <a:lnRef idx="2">
+                          <a:schemeClr val="accent1">
+                            <a:shade val="15000"/>
+                          </a:schemeClr>
+                        </a:lnRef>
+                        <a:fillRef idx="1">
+                          <a:schemeClr val="accent1"/>
+                        </a:fillRef>
+                        <a:effectRef idx="0">
+                          <a:schemeClr val="accent1"/>
+                        </a:effectRef>
+                        <a:fontRef idx="minor">
+                          <a:schemeClr val="lt1"/>
+                        </a:fontRef>
+                      </wps:style>
+                      <wps:txbx>
+                        <w:txbxContent>
+                          <w:p>
+                            <w:pPr>
+                              <w:jc w:val="center"/>
+                            </w:pPr>
+                            <w:r>
+                              <w:rPr>
+                                <w:sz w:val="24"/>
+                                <w:szCs w:val="24"/>
+                              </w:rPr>
+                              <w:t>–</w:t>
+                            </w:r>
+                            <w:r>
+                              <w:t>t</w:t>
+                            </w:r>
+                          </w:p>
+                        </w:txbxContent>
+                      </wps:txbx>
+                      <wps:bodyPr rot="0" spcFirstLastPara="0" vertOverflow="overflow" horzOverflow="overflow" vert="horz" wrap="square" lIns="91440" tIns="45720" rIns="91440" bIns="45720" numCol="1" spcCol="0" rtlCol="0" fromWordArt="0" anchor="ctr" anchorCtr="0" forceAA="0" compatLnSpc="1">
+                        <a:prstTxWarp prst="textNoShape">
+                          <a:avLst/>
+                        </a:prstTxWarp>
+                        <a:noAutofit/>
+                      </wps:bodyPr>
+                    </wps:wsp>
+                  </a:graphicData>
+                </a:graphic>
+                <wp14:sizeRelH relativeFrom="margin">
+                  <wp14:pctWidth>0</wp14:pctWidth>
+                </wp14:sizeRelH>
+                <wp14:sizeRelV relativeFrom="margin">
+                  <wp14:pctHeight>0</wp14:pctHeight>
+                </wp14:sizeRelV>
+              </wp:anchor>
+            </w:drawing>
+          </mc:Choice>
+          <mc:Fallback>
+            <w:pict>
+              <v:rect w14:anchorId="3BE162E8" id="Rectangle 10" o:spid="_x0000_s1032" style="position:absolute;left:0;text-align:left;margin-left:116.8pt;margin-top:2.55pt;width:168pt;height:66.75pt;z-index:251675648;visibility:visible;mso-wrap-style:square;mso-width-percent:0;mso-height-percent:0;mso-wrap-distance-left:9pt;mso-wrap-distance-top:0;mso-wrap-distance-right:9pt;mso-wrap-distance-bottom:0;mso-position-horizontal:right;mso-position-horizontal-relative:margin;mso-position-vertical:absolute;mso-position-vertical-relative:text;mso-width-percent:0;mso-height-percent:0;mso-width-relative:margin;mso-height-relative:margin;v-text-anchor:middle" o:gfxdata="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" fillcolor="white [3212]" strokecolor="red" strokeweight="2.25pt">
+                <v:textbox>
+                  <w:txbxContent>
+                    <w:p>
+                      <w:pPr>
+                        <w:jc w:val="center"/>
+                      </w:pPr>
+                      <w:r>
+                        <w:rPr>
+                          <w:sz w:val="24"/>
+                          <w:szCs w:val="24"/>
+                        </w:rPr>
+                        <w:t>–</w:t>
+                      </w:r>
+                      <w:r>
+                        <w:t>t</w:t>
+                      </w:r>
+                    </w:p>
+                  </w:txbxContent>
+                </v:textbox>
+                <w10:wrap anchorx="margin"/>
+              </v:rect>
+            </w:pict>
+          </mc:Fallback>
+        </mc:AlternateContent>
+      </w:r>
+      <w:r>
+        <w:rPr>
+          <w:noProof/>
+          <w:color w:val="FFFFFF" w:themeColor="background1"/>
+          <w:sz w:val="24"/>
+          <w:szCs w:val="24"/>
+        </w:rPr>
+        <mc:AlternateContent>
+          <mc:Choice Requires="wps">
+            <w:drawing>
+              <wp:anchor distT="0" distB="0" distL="114300" distR="114300" simplePos="0" relativeHeight="251671552" behindDoc="0" locked="0" layoutInCell="1" allowOverlap="1" wp14:anchorId="3D7AB099" wp14:editId="14999232">
+                <wp:simplePos x="0" y="0"/>
+                <wp:positionH relativeFrom="margin">
+                  <wp:align>left</wp:align>
+                </wp:positionH>
+                <wp:positionV relativeFrom="paragraph">
+                  <wp:posOffset>55880</wp:posOffset>
+                </wp:positionV>
+                <wp:extent cx="3562350" cy="1485900"/>
+                <wp:effectExtent l="19050" t="19050" r="19050" b="19050"/>
+                <wp:wrapNone/>
+                <wp:docPr id="8" name="Rectangle 8"/>
+                <wp:cNvGraphicFramePr/>
+                <a:graphic xmlns:a="http://schemas.openxmlformats.org/drawingml/2006/main">
+                  <a:graphicData uri="http://schemas.microsoft.com/office/word/2010/wordprocessingShape">
+                    <wps:wsp>
+                      <wps:cNvSpPr/>
+                      <wps:spPr>
+                        <a:xfrm>
+                          <a:off x="0" y="0"/>
+                          <a:ext cx="3562350" cy="1485900"/>
+                        </a:xfrm>
+                        <a:prstGeom prst="rect">
+                          <a:avLst/>
+                        </a:prstGeom>
+                        <a:solidFill>
+                          <a:schemeClr val="bg1"/>
+                        </a:solidFill>
+                        <a:ln w="28575">
+                          <a:solidFill>
+                            <a:srgbClr val="FF0000"/>
+                          </a:solidFill>
+                        </a:ln>
+                      </wps:spPr>
+                      <wps:style>
+                        <a:lnRef idx="2">
+                          <a:schemeClr val="accent1">
+                            <a:shade val="15000"/>
+                          </a:schemeClr>
+                        </a:lnRef>
+                        <a:fillRef idx="1">
+                          <a:schemeClr val="accent1"/>
+                        </a:fillRef>
+                        <a:effectRef idx="0">
+                          <a:schemeClr val="accent1"/>
+                        </a:effectRef>
+                        <a:fontRef idx="minor">
+                          <a:schemeClr val="lt1"/>
+                        </a:fontRef>
+                      </wps:style>
+                      <wps:txbx>
+                        <w:txbxContent>
+                          <w:p>
+                            <w:pPr>
+                              <w:jc w:val="center"/>
+                            </w:pPr>
+                            <w:r>
+                              <w:rPr>
+                                <w:sz w:val="24"/>
+                                <w:szCs w:val="24"/>
+                              </w:rPr>
+                              <w:t>–</w:t>
+                            </w:r>
+                            <w:r>
+                              <w:t>t</w:t>
+                            </w:r>
+                          </w:p>
+                        </w:txbxContent>
+                      </wps:txbx>
+                      <wps:bodyPr rot="0" spcFirstLastPara="0" vertOverflow="overflow" horzOverflow="overflow" vert="horz" wrap="square" lIns="91440" tIns="45720" rIns="91440" bIns="45720" numCol="1" spcCol="0" rtlCol="0" fromWordArt="0" anchor="ctr" anchorCtr="0" forceAA="0" compatLnSpc="1">
+                        <a:prstTxWarp prst="textNoShape">
+                          <a:avLst/>
+                        </a:prstTxWarp>
+                        <a:noAutofit/>
+                      </wps:bodyPr>
+                    </wps:wsp>
+                  </a:graphicData>
+                </a:graphic>
+                <wp14:sizeRelH relativeFrom="margin">
+                  <wp14:pctWidth>0</wp14:pctWidth>
+                </wp14:sizeRelH>
+                <wp14:sizeRelV relativeFrom="margin">
+                  <wp14:pctHeight>0</wp14:pctHeight>
+                </wp14:sizeRelV>
+              </wp:anchor>
+            </w:drawing>
+          </mc:Choice>
+          <mc:Fallback>
+            <w:pict>
+              <v:rect w14:anchorId="3D7AB099" id="Rectangle 8" o:spid="_x0000_s1033" style="position:absolute;left:0;text-align:left;margin-left:0;margin-top:4.4pt;width:280.5pt;height:117pt;z-index:251671552;visibility:visible;mso-wrap-style:square;mso-width-percent:0;mso-height-percent:0;mso-wrap-distance-left:9pt;mso-wrap-distance-top:0;mso-wrap-distance-right:9pt;mso-wrap-distance-bottom:0;mso-position-horizontal:left;mso-position-horizontal-relative:margin;mso-position-vertical:absolute;mso-position-vertical-relative:text;mso-width-percent:0;mso-height-percent:0;mso-width-relative:margin;mso-height-relative:margin;v-text-anchor:middle" o:gfxdata="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" fillcolor="white [3212]" strokecolor="red" strokeweight="2.25pt">
+                <v:textbox>
+                  <w:txbxContent>
+                    <w:p>
+                      <w:pPr>
+                        <w:jc w:val="center"/>
+                      </w:pPr>
+                      <w:r>
+                        <w:rPr>
+                          <w:sz w:val="24"/>
+                          <w:szCs w:val="24"/>
+                        </w:rPr>
+                        <w:t>–</w:t>
+                      </w:r>
+                      <w:r>
+                        <w:t>t</w:t>
+                      </w:r>
+                    </w:p>
+                  </w:txbxContent>
+                </v:textbox>
+                <w10:wrap anchorx="margin"/>
+              </v:rect>
+            </w:pict>
+          </mc:Fallback>
+        </mc:AlternateContent>
+      </w:r>
+    </w:p>
+    <w:p>
+      <w:pPr>
+        <w:tabs>
+          <w:tab w:val="left" w:pos="6285"/>
+        </w:tabs>
+        <w:jc w:val="center"/>
+        <w:rPr>
+          <w:sz w:val="24"/>
+          <w:szCs w:val="24"/>
+        </w:rPr>
+      </w:pPr>
+    </w:p>
+    <w:p>
+      <w:pPr>
+        <w:tabs>
+          <w:tab w:val="left" w:pos="6285"/>
+        </w:tabs>
+        <w:jc w:val="center"/>
+        <w:rPr>
+          <w:sz w:val="24"/>
+          <w:szCs w:val="24"/>
+        </w:rPr>
+      </w:pPr>
+    </w:p>
+    <w:p>
+      <w:pPr>
+        <w:tabs>
+          <w:tab w:val="left" w:pos="6285"/>
+        </w:tabs>
+        <w:jc w:val="center"/>
+        <w:rPr>
+          <w:sz w:val="24"/>
+          <w:szCs w:val="24"/>
+        </w:rPr>
+      </w:pPr>
+      <w:r>
+        <w:rPr>
+          <w:noProof/>
+          <w:color w:val="FFFFFF" w:themeColor="background1"/>
+          <w:sz w:val="24"/>
+          <w:szCs w:val="24"/>
+        </w:rPr>
+        <mc:AlternateContent>
+          <mc:Choice Requires="wps">
+            <w:drawing>
+              <wp:anchor distT="0" distB="0" distL="114300" distR="114300" simplePos="0" relativeHeight="251673600" behindDoc="0" locked="0" layoutInCell="1" allowOverlap="1" wp14:anchorId="2389766A" wp14:editId="4710BD7F">
+                <wp:simplePos x="0" y="0"/>
+                <wp:positionH relativeFrom="column">
+                  <wp:posOffset>3867150</wp:posOffset>
+                </wp:positionH>
+                <wp:positionV relativeFrom="paragraph">
+                  <wp:posOffset>76835</wp:posOffset>
+                </wp:positionV>
+                <wp:extent cx="1590675" cy="1628775"/>
+                <wp:effectExtent l="19050" t="19050" r="28575" b="28575"/>
+                <wp:wrapNone/>
+                <wp:docPr id="9" name="Rectangle 9"/>
+                <wp:cNvGraphicFramePr/>
+                <a:graphic xmlns:a="http://schemas.openxmlformats.org/drawingml/2006/main">
+                  <a:graphicData uri="http://schemas.microsoft.com/office/word/2010/wordprocessingShape">
+                    <wps:wsp>
+                      <wps:cNvSpPr/>
+                      <wps:spPr>
+                        <a:xfrm>
+                          <a:off x="0" y="0"/>
+                          <a:ext cx="1590675" cy="1628775"/>
+                        </a:xfrm>
+                        <a:prstGeom prst="rect">
+                          <a:avLst/>
+                        </a:prstGeom>
+                        <a:solidFill>
+                          <a:schemeClr val="bg1"/>
+                        </a:solidFill>
+                        <a:ln w="28575">
+                          <a:solidFill>
+                            <a:srgbClr val="FF0000"/>
+                          </a:solidFill>
+                        </a:ln>
+                      </wps:spPr>
+                      <wps:style>
+                        <a:lnRef idx="2">
+                          <a:schemeClr val="accent1">
+                            <a:shade val="15000"/>
+                          </a:schemeClr>
+                        </a:lnRef>
+                        <a:fillRef idx="1">
+                          <a:schemeClr val="accent1"/>
+                        </a:fillRef>
+                        <a:effectRef idx="0">
+                          <a:schemeClr val="accent1"/>
+                        </a:effectRef>
+                        <a:fontRef idx="minor">
+                          <a:schemeClr val="lt1"/>
+                        </a:fontRef>
+                      </wps:style>
+                      <wps:txbx>
+                        <w:txbxContent>
+                          <w:p>
+                            <w:pPr>
+                              <w:jc w:val="center"/>
+                            </w:pPr>
+                            <w:r>
+                              <w:rPr>
+                                <w:sz w:val="24"/>
+                                <w:szCs w:val="24"/>
+                              </w:rPr>
+                              <w:t>–</w:t>
+                            </w:r>
+                            <w:r>
+                              <w:t>t</w:t>
+                            </w:r>
+                          </w:p>
+                        </w:txbxContent>
+                      </wps:txbx>
+                      <wps:bodyPr rot="0" spcFirstLastPara="0" vertOverflow="overflow" horzOverflow="overflow" vert="horz" wrap="square" lIns="91440" tIns="45720" rIns="91440" bIns="45720" numCol="1" spcCol="0" rtlCol="0" fromWordArt="0" anchor="ctr" anchorCtr="0" forceAA="0" compatLnSpc="1">
+                        <a:prstTxWarp prst="textNoShape">
+                          <a:avLst/>
+                        </a:prstTxWarp>
+                        <a:noAutofit/>
+                      </wps:bodyPr>
+                    </wps:wsp>
+                  </a:graphicData>
+                </a:graphic>
+                <wp14:sizeRelH relativeFrom="margin">
+                  <wp14:pctWidth>0</wp14:pctWidth>
+                </wp14:sizeRelH>
+                <wp14:sizeRelV relativeFrom="margin">
+                  <wp14:pctHeight>0</wp14:pctHeight>
+                </wp14:sizeRelV>
+              </wp:anchor>
+            </w:drawing>
+          </mc:Choice>
+          <mc:Fallback>
+            <w:pict>
+              <v:rect w14:anchorId="2389766A" id="Rectangle 9" o:spid="_x0000_s1034" style="position:absolute;left:0;text-align:left;margin-left:304.5pt;margin-top:6.05pt;width:125.25pt;height:128.25pt;z-index:251673600;visibility:visible;mso-wrap-style:square;mso-width-percent:0;mso-height-percent:0;mso-wrap-distance-left:9pt;mso-wrap-distance-top:0;mso-wrap-distance-right:9pt;mso-wrap-distance-bottom:0;mso-position-horizontal:absolute;mso-position-horizontal-relative:text;mso-position-vertical:absolute;mso-position-vertical-relative:text;mso-width-percent:0;mso-height-percent:0;mso-width-relative:margin;mso-height-relative:margin;v-text-anchor:middle" o:gfxdata="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" fillcolor="white [3212]" strokecolor="red" strokeweight="2.25pt">
+                <v:textbox>
+                  <w:txbxContent>
+                    <w:p>
+                      <w:pPr>
+                        <w:jc w:val="center"/>
+                      </w:pPr>
+                      <w:r>
+                        <w:rPr>
+                          <w:sz w:val="24"/>
+                          <w:szCs w:val="24"/>
+                        </w:rPr>
+                        <w:t>–</w:t>
+                      </w:r>
+                      <w:r>
+                        <w:t>t</w:t>
+                      </w:r>
+                    </w:p>
+                  </w:txbxContent>
+                </v:textbox>
+              </v:rect>
+            </w:pict>
+          </mc:Fallback>
+        </mc:AlternateContent>
+      </w:r>
+    </w:p>
+    <w:p>
+      <w:pPr>
+        <w:tabs>
+          <w:tab w:val="left" w:pos="6285"/>
+        </w:tabs>
+        <w:jc w:val="center"/>
+        <w:rPr>
+          <w:sz w:val="24"/>
+          <w:szCs w:val="24"/>
+        </w:rPr>
+      </w:pPr>
+    </w:p>
+    <w:p>
+      <w:pPr>
+        <w:tabs>
+          <w:tab w:val="left" w:pos="6285"/>
+        </w:tabs>
+        <w:jc w:val="center"/>
+        <w:rPr>
+          <w:sz w:val="24"/>
+          <w:szCs w:val="24"/>
+        </w:rPr>
+      </w:pPr>
+    </w:p>
+    <w:p>
+      <w:pPr>
+        <w:tabs>
+          <w:tab w:val="left" w:pos="6285"/>
+        </w:tabs>
+        <w:jc w:val="center"/>
+        <w:rPr>
+          <w:sz w:val="24"/>
+          <w:szCs w:val="24"/>
+        </w:rPr>
+      </w:pPr>
+      <w:r>
+        <w:rPr>
+          <w:noProof/>
+          <w:color w:val="FFFFFF" w:themeColor="background1"/>
+          <w:sz w:val="24"/>
+          <w:szCs w:val="24"/>
+        </w:rPr>
+        <mc:AlternateContent>
+          <mc:Choice Requires="wps">
+            <w:drawing>
+              <wp:anchor distT="0" distB="0" distL="114300" distR="114300" simplePos="0" relativeHeight="251677696" behindDoc="0" locked="0" layoutInCell="1" allowOverlap="1" wp14:anchorId="15EB51F8" wp14:editId="25CDBC66">
+                <wp:simplePos x="0" y="0"/>
+                <wp:positionH relativeFrom="margin">
+                  <wp:align>left</wp:align>
+                </wp:positionH>
+                <wp:positionV relativeFrom="paragraph">
+                  <wp:posOffset>26035</wp:posOffset>
+                </wp:positionV>
+                <wp:extent cx="1514475" cy="1476375"/>
+                <wp:effectExtent l="19050" t="19050" r="28575" b="28575"/>
+                <wp:wrapNone/>
+                <wp:docPr id="11" name="Rectangle 11"/>
+                <wp:cNvGraphicFramePr/>
+                <a:graphic xmlns:a="http://schemas.openxmlformats.org/drawingml/2006/main">
+                  <a:graphicData uri="http://schemas.microsoft.com/office/word/2010/wordprocessingShape">
+                    <wps:wsp>
+                      <wps:cNvSpPr/>
+                      <wps:spPr>
+                        <a:xfrm>
+                          <a:off x="0" y="0"/>
+                          <a:ext cx="1514475" cy="1476375"/>
+                        </a:xfrm>
+                        <a:prstGeom prst="rect">
+                          <a:avLst/>
+                        </a:prstGeom>
+                        <a:solidFill>
+                          <a:schemeClr val="bg1"/>
+                        </a:solidFill>
+                        <a:ln w="28575">
+                          <a:solidFill>
+                            <a:srgbClr val="FF0000"/>
+                          </a:solidFill>
+                        </a:ln>
+                      </wps:spPr>
+                      <wps:style>
+                        <a:lnRef idx="2">
+                          <a:schemeClr val="accent1">
+                            <a:shade val="15000"/>
+                          </a:schemeClr>
+                        </a:lnRef>
+                        <a:fillRef idx="1">
+                          <a:schemeClr val="accent1"/>
+                        </a:fillRef>
+                        <a:effectRef idx="0">
+                          <a:schemeClr val="accent1"/>
+                        </a:effectRef>
+                        <a:fontRef idx="minor">
+                          <a:schemeClr val="lt1"/>
+                        </a:fontRef>
+                      </wps:style>
+                      <wps:txbx>
+                        <w:txbxContent>
+                          <w:p>
+                            <w:pPr>
+                              <w:jc w:val="center"/>
+                            </w:pPr>
+                            <w:r>
+                              <w:rPr>
+                                <w:sz w:val="24"/>
+                                <w:szCs w:val="24"/>
+                              </w:rPr>
+                              <w:t>–</w:t>
+                            </w:r>
+                            <w:r>
+                              <w:t>t</w:t>
+                            </w:r>
+                          </w:p>
+                        </w:txbxContent>
+                      </wps:txbx>
+                      <wps:bodyPr rot="0" spcFirstLastPara="0" vertOverflow="overflow" horzOverflow="overflow" vert="horz" wrap="square" lIns="91440" tIns="45720" rIns="91440" bIns="45720" numCol="1" spcCol="0" rtlCol="0" fromWordArt="0" anchor="ctr" anchorCtr="0" forceAA="0" compatLnSpc="1">
+                        <a:prstTxWarp prst="textNoShape">
+                          <a:avLst/>
+                        </a:prstTxWarp>
+                        <a:noAutofit/>
+                      </wps:bodyPr>
+                    </wps:wsp>
+                  </a:graphicData>
+                </a:graphic>
+                <wp14:sizeRelH relativeFrom="margin">
+                  <wp14:pctWidth>0</wp14:pctWidth>
+                </wp14:sizeRelH>
+                <wp14:sizeRelV relativeFrom="margin">
+                  <wp14:pctHeight>0</wp14:pctHeight>
+                </wp14:sizeRelV>
+              </wp:anchor>
+            </w:drawing>
+          </mc:Choice>
+          <mc:Fallback>
+            <w:pict>
+              <v:rect w14:anchorId="15EB51F8" id="Rectangle 11" o:spid="_x0000_s1035" style="position:absolute;left:0;text-align:left;margin-left:0;margin-top:2.05pt;width:119.25pt;height:116.25pt;z-index:251677696;visibility:visible;mso-wrap-style:square;mso-width-percent:0;mso-height-percent:0;mso-wrap-distance-left:9pt;mso-wrap-distance-top:0;mso-wrap-distance-right:9pt;mso-wrap-distance-bottom:0;mso-position-horizontal:left;mso-position-horizontal-relative:margin;mso-position-vertical:absolute;mso-position-vertical-relative:text;mso-width-percent:0;mso-height-percent:0;mso-width-relative:margin;mso-height-relative:margin;v-text-anchor:middle" o:gfxdata="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" fillcolor="white [3212]" strokecolor="red" strokeweight="2.25pt">
+                <v:textbox>
+                  <w:txbxContent>
+                    <w:p>
+                      <w:pPr>
+                        <w:jc w:val="center"/>
+                      </w:pPr>
+                      <w:r>
+                        <w:rPr>
+                          <w:sz w:val="24"/>
+                          <w:szCs w:val="24"/>
+                        </w:rPr>
+                        <w:t>–</w:t>
+                      </w:r>
+                      <w:r>
+                        <w:t>t</w:t>
+                      </w:r>
+                    </w:p>
+                  </w:txbxContent>
+                </v:textbox>
+                <w10:wrap anchorx="margin"/>
+              </v:rect>
+            </w:pict>
+          </mc:Fallback>
+        </mc:AlternateContent>
+      </w:r>
+    </w:p>
+    <w:p>
+      <w:pPr>
+        <w:tabs>
+          <w:tab w:val="left" w:pos="6285"/>
+        </w:tabs>
+        <w:jc w:val="center"/>
+        <w:rPr>
+          <w:sz w:val="24"/>
+          <w:szCs w:val="24"/>
+        </w:rPr>
+      </w:pPr>
+    </w:p>
+    <w:p>
+      <w:pPr>
+        <w:tabs>
+          <w:tab w:val="left" w:pos="6285"/>
+        </w:tabs>
+        <w:jc w:val="center"/>
+        <w:rPr>
+          <w:sz w:val="24"/>
+          <w:szCs w:val="24"/>
+        </w:rPr>
+      </w:pPr>
+    </w:p>
+    <w:p>
+      <w:pPr>
+        <w:tabs>
+          <w:tab w:val="left" w:pos="6285"/>
+        </w:tabs>
+        <w:jc w:val="center"/>
+        <w:rPr>
+          <w:sz w:val="24"/>
+          <w:szCs w:val="24"/>
+        </w:rPr>
+      </w:pPr>
+      <w:r>
+        <w:rPr>
+          <w:noProof/>
+          <w:color w:val="FFFFFF" w:themeColor="background1"/>
+          <w:sz w:val="24"/>
+          <w:szCs w:val="24"/>
+        </w:rPr>
+        <mc:AlternateContent>
+          <mc:Choice Requires="wps">
+            <w:drawing>
+              <wp:anchor distT="0" distB="0" distL="114300" distR="114300" simplePos="0" relativeHeight="251679744" behindDoc="0" locked="0" layoutInCell="1" allowOverlap="1" wp14:anchorId="78D56E83" wp14:editId="3102F719">
+                <wp:simplePos x="0" y="0"/>
+                <wp:positionH relativeFrom="column">
+                  <wp:posOffset>2000250</wp:posOffset>
+                </wp:positionH>
+                <wp:positionV relativeFrom="paragraph">
+                  <wp:posOffset>31750</wp:posOffset>
+                </wp:positionV>
+                <wp:extent cx="1924050" cy="723900"/>
+                <wp:effectExtent l="19050" t="19050" r="19050" b="19050"/>
+                <wp:wrapNone/>
+                <wp:docPr id="12" name="Rectangle 12"/>
+                <wp:cNvGraphicFramePr/>
+                <a:graphic xmlns:a="http://schemas.openxmlformats.org/drawingml/2006/main">
+                  <a:graphicData uri="http://schemas.microsoft.com/office/word/2010/wordprocessingShape">
+                    <wps:wsp>
+                      <wps:cNvSpPr/>
+                      <wps:spPr>
+                        <a:xfrm>
+                          <a:off x="0" y="0"/>
+                          <a:ext cx="1924050" cy="723900"/>
+                        </a:xfrm>
+                        <a:prstGeom prst="rect">
+                          <a:avLst/>
+                        </a:prstGeom>
+                        <a:solidFill>
+                          <a:schemeClr val="bg1"/>
+                        </a:solidFill>
+                        <a:ln w="28575">
+                          <a:solidFill>
+                            <a:srgbClr val="FF0000"/>
+                          </a:solidFill>
+                        </a:ln>
+                      </wps:spPr>
+                      <wps:style>
+                        <a:lnRef idx="2">
+                          <a:schemeClr val="accent1">
+                            <a:shade val="15000"/>
+                          </a:schemeClr>
+                        </a:lnRef>
+                        <a:fillRef idx="1">
+                          <a:schemeClr val="accent1"/>
+                        </a:fillRef>
+                        <a:effectRef idx="0">
+                          <a:schemeClr val="accent1"/>
+                        </a:effectRef>
+                        <a:fontRef idx="minor">
+                          <a:schemeClr val="lt1"/>
+                        </a:fontRef>
+                      </wps:style>
+                      <wps:txbx>
+                        <w:txbxContent>
+                          <w:p>
+                            <w:pPr>
+                              <w:jc w:val="center"/>
+                            </w:pPr>
+                            <w:r>
+                              <w:rPr>
+                                <w:sz w:val="24"/>
+                                <w:szCs w:val="24"/>
+                              </w:rPr>
+                              <w:t>–</w:t>
+                            </w:r>
+                            <w:r>
+                              <w:t>t</w:t>
+                            </w:r>
+                          </w:p>
+                        </w:txbxContent>
+                      </wps:txbx>
+                      <wps:bodyPr rot="0" spcFirstLastPara="0" vertOverflow="overflow" horzOverflow="overflow" vert="horz" wrap="square" lIns="91440" tIns="45720" rIns="91440" bIns="45720" numCol="1" spcCol="0" rtlCol="0" fromWordArt="0" anchor="ctr" anchorCtr="0" forceAA="0" compatLnSpc="1">
+                        <a:prstTxWarp prst="textNoShape">
+                          <a:avLst/>
+                        </a:prstTxWarp>
+                        <a:noAutofit/>
+                      </wps:bodyPr>
+                    </wps:wsp>
+                  </a:graphicData>
+                </a:graphic>
+                <wp14:sizeRelH relativeFrom="margin">
+                  <wp14:pctWidth>0</wp14:pctWidth>
+                </wp14:sizeRelH>
+                <wp14:sizeRelV relativeFrom="margin">
+                  <wp14:pctHeight>0</wp14:pctHeight>
+                </wp14:sizeRelV>
+              </wp:anchor>
+            </w:drawing>
+          </mc:Choice>
+          <mc:Fallback>
+            <w:pict>
+              <v:rect w14:anchorId="78D56E83" id="Rectangle 12" o:spid="_x0000_s1036" style="position:absolute;left:0;text-align:left;margin-left:157.5pt;margin-top:2.5pt;width:151.5pt;height:57pt;z-index:251679744;visibility:visible;mso-wrap-style:square;mso-width-percent:0;mso-height-percent:0;mso-wrap-distance-left:9pt;mso-wrap-distance-top:0;mso-wrap-distance-right:9pt;mso-wrap-distance-bottom:0;mso-position-horizontal:absolute;mso-position-horizontal-relative:text;mso-position-vertical:absolute;mso-position-vertical-relative:text;mso-width-percent:0;mso-height-percent:0;mso-width-relative:margin;mso-height-relative:margin;v-text-anchor:middle" o:gfxdata="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" fillcolor="white [3212]" strokecolor="red" strokeweight="2.25pt">
+                <v:textbox>
+                  <w:txbxContent>
+                    <w:p>
+                      <w:pPr>
+                        <w:jc w:val="center"/>
+                      </w:pPr>
+                      <w:r>
+                        <w:rPr>
+                          <w:sz w:val="24"/>
+                          <w:szCs w:val="24"/>
+                        </w:rPr>
+                        <w:t>–</w:t>
+                      </w:r>
+                      <w:r>
+                        <w:t>t</w:t>
+                      </w:r>
+                    </w:p>
+                  </w:txbxContent>
+                </v:textbox>
+              </v:rect>
+            </w:pict>
+          </mc:Fallback>
+        </mc:AlternateContent>
+      </w:r>
+    </w:p>
+    <w:p>
+      <w:pPr>
+        <w:tabs>
+          <w:tab w:val="left" w:pos="6285"/>
+        </w:tabs>
+        <w:jc w:val="center"/>
+        <w:rPr>
+          <w:sz w:val="24"/>
+          <w:szCs w:val="24"/>
+        </w:rPr>
+      </w:pPr>
+    </w:p>
+    <w:p>
+      <w:pPr>
+        <w:tabs>
+          <w:tab w:val="left" w:pos="6285"/>
+        </w:tabs>
+        <w:jc w:val="center"/>
+        <w:rPr>
+          <w:sz w:val="24"/>
+          <w:szCs w:val="24"/>
+        </w:rPr>
+      </w:pPr>
+    </w:p>
+    <w:p>
+      <w:pPr>
+        <w:tabs>
+          <w:tab w:val="left" w:pos="6285"/>
+        </w:tabs>
+        <w:jc w:val="center"/>
+        <w:rPr>
+          <w:sz w:val="24"/>
+          <w:szCs w:val="24"/>
+        </w:rPr>
+      </w:pPr>
+    </w:p>
+    <w:p>
+      <w:pPr>
+        <w:tabs>
+          <w:tab w:val="left" w:pos="6285"/>
+        </w:tabs>
+        <w:jc w:val="center"/>
+        <w:rPr>
+          <w:sz w:val="24"/>
+          <w:szCs w:val="24"/>
+        </w:rPr>
+      </w:pPr>
+      <w:r>
+        <w:rPr>
+          <w:sz w:val="24"/>
+          <w:szCs w:val="24"/>
+        </w:rPr>
+        <w:t>The final result of room placement will look something like this but fill an entire map with a much greater amount of rooms</w:t>
+      </w:r>
+    </w:p>
+    <w:p>
+      <w:pPr>
+        <w:tabs>
+          <w:tab w:val="left" w:pos="6285"/>
+        </w:tabs>
+        <w:jc w:val="center"/>
+        <w:rPr>
+          <w:sz w:val="24"/>
+          <w:szCs w:val="24"/>
+        </w:rPr>
+      </w:pPr>
+    </w:p>
+    <w:p>
+      <w:pPr>
+        <w:tabs>
+          <w:tab w:val="left" w:pos="6285"/>
+        </w:tabs>
+        <w:jc w:val="center"/>
+        <w:rPr>
+          <w:sz w:val="24"/>
+          <w:szCs w:val="24"/>
+        </w:rPr>
+      </w:pPr>
+    </w:p>
+    <w:p>
+      <w:pPr>
+        <w:tabs>
+          <w:tab w:val="left" w:pos="6285"/>
+        </w:tabs>
+        <w:jc w:val="center"/>
+        <w:rPr>
+          <w:sz w:val="24"/>
+          <w:szCs w:val="24"/>
+        </w:rPr>
+      </w:pPr>
+    </w:p>
+    <w:p>
+      <w:pPr>
+        <w:tabs>
+          <w:tab w:val="left" w:pos="6285"/>
+        </w:tabs>
+        <w:jc w:val="center"/>
+        <w:rPr>
+          <w:sz w:val="24"/>
+          <w:szCs w:val="24"/>
+        </w:rPr>
+      </w:pPr>
+    </w:p>
+    <w:p>
+      <w:pPr>
+        <w:tabs>
+          <w:tab w:val="left" w:pos="6285"/>
+        </w:tabs>
+        <w:jc w:val="center"/>
+        <w:rPr>
+          <w:sz w:val="28"/>
+          <w:szCs w:val="28"/>
+        </w:rPr>
+      </w:pPr>
+      <w:r>
+        <w:rPr>
+          <w:sz w:val="28"/>
+          <w:szCs w:val="28"/>
+        </w:rPr>
+        <w:lastRenderedPageBreak/>
+        <w:t>CONNECTIONS</w:t>
+      </w:r>
+    </w:p>
+    <w:p>
+      <w:pPr>
+        <w:tabs>
+          <w:tab w:val="left" w:pos="6285"/>
+        </w:tabs>
+        <w:jc w:val="center"/>
+        <w:rPr>
+          <w:sz w:val="24"/>
+          <w:szCs w:val="24"/>
+        </w:rPr>
+      </w:pPr>
+      <w:r>
+        <w:rPr>
+          <w:sz w:val="24"/>
+          <w:szCs w:val="24"/>
+        </w:rPr>
+        <w:t>a</w:t>
+      </w:r>
     </w:p>
     <w:p>
       <w:pPr>
@@ -9042,11 +11246,11 @@
           <w:szCs w:val="50"/>
         </w:rPr>
       </w:pPr>
-      <w:bookmarkStart w:id="24" w:name="__RefHeading___Toc1045_50594169"/>
-      <w:bookmarkStart w:id="25" w:name="_Toc229035142"/>
-      <w:bookmarkStart w:id="26" w:name="_Toc222817107"/>
-      <w:bookmarkStart w:id="27" w:name="_Toc239941475"/>
-      <w:bookmarkEnd w:id="24"/>
+      <w:bookmarkStart w:id="14" w:name="__RefHeading___Toc1045_50594169"/>
+      <w:bookmarkStart w:id="15" w:name="_Toc229035142"/>
+      <w:bookmarkStart w:id="16" w:name="_Toc222817107"/>
+      <w:bookmarkStart w:id="17" w:name="_Toc240354270"/>
+      <w:bookmarkEnd w:id="14"/>
       <w:r>
         <w:rPr>
           <w:sz w:val="50"/>
@@ -9054,9 +11258,9 @@
         </w:rPr>
         <w:t>Design</w:t>
       </w:r>
-      <w:bookmarkEnd w:id="25"/>
-      <w:bookmarkEnd w:id="26"/>
-      <w:bookmarkEnd w:id="27"/>
+      <w:bookmarkEnd w:id="15"/>
+      <w:bookmarkEnd w:id="16"/>
+      <w:bookmarkEnd w:id="17"/>
     </w:p>
     <w:p>
       <w:pPr>
@@ -9066,11 +11270,11 @@
           <w:szCs w:val="50"/>
         </w:rPr>
       </w:pPr>
-      <w:bookmarkStart w:id="28" w:name="__RefHeading___Toc1047_50594169"/>
-      <w:bookmarkStart w:id="29" w:name="_Toc229035143"/>
-      <w:bookmarkStart w:id="30" w:name="_Toc222817108"/>
-      <w:bookmarkStart w:id="31" w:name="_Toc239941476"/>
-      <w:bookmarkEnd w:id="28"/>
+      <w:bookmarkStart w:id="18" w:name="__RefHeading___Toc1047_50594169"/>
+      <w:bookmarkStart w:id="19" w:name="_Toc229035143"/>
+      <w:bookmarkStart w:id="20" w:name="_Toc222817108"/>
+      <w:bookmarkStart w:id="21" w:name="_Toc240354271"/>
+      <w:bookmarkEnd w:id="18"/>
       <w:r>
         <w:rPr>
           <w:sz w:val="50"/>
@@ -9078,9 +11282,9 @@
         </w:rPr>
         <w:t>Technical solution</w:t>
       </w:r>
-      <w:bookmarkEnd w:id="29"/>
-      <w:bookmarkEnd w:id="30"/>
-      <w:bookmarkEnd w:id="31"/>
+      <w:bookmarkEnd w:id="19"/>
+      <w:bookmarkEnd w:id="20"/>
+      <w:bookmarkEnd w:id="21"/>
     </w:p>
     <w:p>
       <w:pPr>
@@ -9090,11 +11294,11 @@
           <w:szCs w:val="50"/>
         </w:rPr>
       </w:pPr>
-      <w:bookmarkStart w:id="32" w:name="__RefHeading___Toc1049_50594169"/>
-      <w:bookmarkStart w:id="33" w:name="_Toc229035144"/>
-      <w:bookmarkStart w:id="34" w:name="_Toc222817109"/>
-      <w:bookmarkStart w:id="35" w:name="_Toc239941477"/>
-      <w:bookmarkEnd w:id="32"/>
+      <w:bookmarkStart w:id="22" w:name="__RefHeading___Toc1049_50594169"/>
+      <w:bookmarkStart w:id="23" w:name="_Toc229035144"/>
+      <w:bookmarkStart w:id="24" w:name="_Toc222817109"/>
+      <w:bookmarkStart w:id="25" w:name="_Toc240354272"/>
+      <w:bookmarkEnd w:id="22"/>
       <w:r>
         <w:rPr>
           <w:sz w:val="50"/>
@@ -9102,19 +11306,19 @@
         </w:rPr>
         <w:t>Testing</w:t>
       </w:r>
-      <w:bookmarkEnd w:id="33"/>
-      <w:bookmarkEnd w:id="34"/>
-      <w:bookmarkEnd w:id="35"/>
+      <w:bookmarkEnd w:id="23"/>
+      <w:bookmarkEnd w:id="24"/>
+      <w:bookmarkEnd w:id="25"/>
     </w:p>
     <w:p>
       <w:pPr>
         <w:pStyle w:val="Heading1"/>
       </w:pPr>
-      <w:bookmarkStart w:id="36" w:name="__RefHeading___Toc1051_50594169"/>
-      <w:bookmarkStart w:id="37" w:name="_Toc229035145"/>
-      <w:bookmarkStart w:id="38" w:name="_Toc222817110"/>
-      <w:bookmarkStart w:id="39" w:name="_Toc239941478"/>
-      <w:bookmarkEnd w:id="36"/>
+      <w:bookmarkStart w:id="26" w:name="__RefHeading___Toc1051_50594169"/>
+      <w:bookmarkStart w:id="27" w:name="_Toc229035145"/>
+      <w:bookmarkStart w:id="28" w:name="_Toc222817110"/>
+      <w:bookmarkStart w:id="29" w:name="_Toc240354273"/>
+      <w:bookmarkEnd w:id="26"/>
       <w:r>
         <w:rPr>
           <w:sz w:val="50"/>
@@ -9122,9 +11326,9 @@
         </w:rPr>
         <w:t>Evaluation</w:t>
       </w:r>
-      <w:bookmarkEnd w:id="37"/>
-      <w:bookmarkEnd w:id="38"/>
-      <w:bookmarkEnd w:id="39"/>
+      <w:bookmarkEnd w:id="27"/>
+      <w:bookmarkEnd w:id="28"/>
+      <w:bookmarkEnd w:id="29"/>
     </w:p>
     <w:p/>
     <w:p/>

</xml_diff>